<commit_message>
add new eyecatches, new assets
</commit_message>
<xml_diff>
--- a/game/assets/Program Booklet/OO2 Program.docx
+++ b/game/assets/Program Booklet/OO2 Program.docx
@@ -41,7 +41,7 @@
           <w:pgNumType w:start="1"/>
         </w:sectPr>
       </w:pPr>
-      <w:bookmarkStart w:colFirst="0" w:colLast="0" w:name="_nvjonocz5n1o" w:id="0"/>
+      <w:bookmarkStart w:colFirst="0" w:colLast="0" w:name="_tca85gyzznox" w:id="0"/>
       <w:bookmarkEnd w:id="0"/>
       <w:r>
         <w:rPr>
@@ -92,12 +92,12 @@
             <wp:extent cx="5943600" cy="3302000"/>
             <wp:effectExtent b="0" l="0" r="0" t="0"/>
             <wp:wrapNone/>
-            <wp:docPr id="4" name="image3.png"/>
+            <wp:docPr id="6" name="image4.png"/>
             <a:graphic>
               <a:graphicData uri="http://schemas.openxmlformats.org/drawingml/2006/picture">
                 <pic:pic>
                   <pic:nvPicPr>
-                    <pic:cNvPr id="0" name="image3.png"/>
+                    <pic:cNvPr id="0" name="image4.png"/>
                     <pic:cNvPicPr preferRelativeResize="0"/>
                   </pic:nvPicPr>
                   <pic:blipFill>
@@ -1357,7 +1357,7 @@
         <w:rPr>
           <w:rtl w:val="0"/>
         </w:rPr>
-        <w:t xml:space="preserve">Chomp Martinez Cuevas</w:t>
+        <w:t xml:space="preserve">Chomp</w:t>
       </w:r>
     </w:p>
     <w:p>
@@ -2459,6 +2459,62 @@
               <w:rPr>
                 <w:b w:val="1"/>
                 <w:bCs w:val="1"/>
+                <w:sz w:val="23"/>
+                <w:szCs w:val="23"/>
+              </w:rPr>
+            </w:pPr>
+            <w:r>
+              <w:rPr>
+                <w:rFonts w:ascii="Arial Unicode MS" w:cs="Arial Unicode MS" w:eastAsia="Arial Unicode MS" w:hAnsi="Arial Unicode MS"/>
+                <w:b w:val="1"/>
+                <w:bCs w:val="1"/>
+                <w:sz w:val="23"/>
+                <w:szCs w:val="23"/>
+                <w:rtl w:val="0"/>
+              </w:rPr>
+              <w:t xml:space="preserve">Fumetsu no Hero  不滅のヒーロー</w:t>
+            </w:r>
+          </w:p>
+          <w:p>
+            <w:pPr>
+              <w:keepNext w:val="1"/>
+              <w:widowControl w:val="0"/>
+              <w:spacing w:line="240" w:lineRule="auto"/>
+              <w:rPr/>
+            </w:pPr>
+            <w:r>
+              <w:rPr>
+                <w:rtl w:val="0"/>
+              </w:rPr>
+              <w:t xml:space="preserve">Masaaki Endo</w:t>
+            </w:r>
+          </w:p>
+          <w:p>
+            <w:pPr>
+              <w:widowControl w:val="0"/>
+              <w:spacing w:after="290" w:line="240" w:lineRule="auto"/>
+              <w:rPr>
+                <w:i w:val="1"/>
+                <w:iCs w:val="1"/>
+              </w:rPr>
+            </w:pPr>
+            <w:r>
+              <w:rPr>
+                <w:i w:val="1"/>
+                <w:iCs w:val="1"/>
+                <w:rtl w:val="0"/>
+              </w:rPr>
+              <w:t xml:space="preserve">Arr. Ko Tanaka</w:t>
+            </w:r>
+          </w:p>
+          <w:p>
+            <w:pPr>
+              <w:keepNext w:val="1"/>
+              <w:widowControl w:val="0"/>
+              <w:spacing w:line="240" w:lineRule="auto"/>
+              <w:rPr>
+                <w:b w:val="1"/>
+                <w:bCs w:val="1"/>
                 <w:sz w:val="26"/>
                 <w:szCs w:val="26"/>
               </w:rPr>
@@ -2471,7 +2527,7 @@
                 <w:szCs w:val="26"/>
                 <w:rtl w:val="0"/>
               </w:rPr>
-              <w:t xml:space="preserve">Fumetsu no Hero</w:t>
+              <w:t xml:space="preserve">Butter-Fly</w:t>
             </w:r>
           </w:p>
           <w:p>
@@ -2485,7 +2541,7 @@
               <w:rPr>
                 <w:rtl w:val="0"/>
               </w:rPr>
-              <w:t xml:space="preserve">Masaaki Endo</w:t>
+              <w:t xml:space="preserve">Hidenori Chiwata</w:t>
             </w:r>
           </w:p>
           <w:p>
@@ -2503,7 +2559,7 @@
                 <w:iCs w:val="1"/>
                 <w:rtl w:val="0"/>
               </w:rPr>
-              <w:t xml:space="preserve">Arr. Ko Tanaka</w:t>
+              <w:t xml:space="preserve">Arr. Richard Lu</w:t>
             </w:r>
           </w:p>
           <w:p>
@@ -2514,19 +2570,20 @@
               <w:rPr>
                 <w:b w:val="1"/>
                 <w:bCs w:val="1"/>
-                <w:sz w:val="26"/>
-                <w:szCs w:val="26"/>
-              </w:rPr>
-            </w:pPr>
-            <w:r>
-              <w:rPr>
-                <w:b w:val="1"/>
-                <w:bCs w:val="1"/>
-                <w:sz w:val="26"/>
-                <w:szCs w:val="26"/>
-                <w:rtl w:val="0"/>
-              </w:rPr>
-              <w:t xml:space="preserve">Butter-Fly</w:t>
+                <w:sz w:val="23"/>
+                <w:szCs w:val="23"/>
+              </w:rPr>
+            </w:pPr>
+            <w:r>
+              <w:rPr>
+                <w:rFonts w:ascii="Arial Unicode MS" w:cs="Arial Unicode MS" w:eastAsia="Arial Unicode MS" w:hAnsi="Arial Unicode MS"/>
+                <w:b w:val="1"/>
+                <w:bCs w:val="1"/>
+                <w:sz w:val="23"/>
+                <w:szCs w:val="23"/>
+                <w:rtl w:val="0"/>
+              </w:rPr>
+              <w:t xml:space="preserve">Hana Ni Natte  花になって</w:t>
             </w:r>
           </w:p>
           <w:p>
@@ -2540,7 +2597,7 @@
               <w:rPr>
                 <w:rtl w:val="0"/>
               </w:rPr>
-              <w:t xml:space="preserve">Hidenori Chiwata</w:t>
+              <w:t xml:space="preserve">Shingo Anami</w:t>
             </w:r>
           </w:p>
           <w:p>
@@ -2558,7 +2615,7 @@
                 <w:iCs w:val="1"/>
                 <w:rtl w:val="0"/>
               </w:rPr>
-              <w:t xml:space="preserve">Arr. Richard Lu</w:t>
+              <w:t xml:space="preserve">Arr. Kohsuke Negishi</w:t>
             </w:r>
           </w:p>
           <w:p>
@@ -2569,19 +2626,20 @@
               <w:rPr>
                 <w:b w:val="1"/>
                 <w:bCs w:val="1"/>
-                <w:sz w:val="26"/>
-                <w:szCs w:val="26"/>
-              </w:rPr>
-            </w:pPr>
-            <w:r>
-              <w:rPr>
-                <w:b w:val="1"/>
-                <w:bCs w:val="1"/>
-                <w:sz w:val="26"/>
-                <w:szCs w:val="26"/>
-                <w:rtl w:val="0"/>
-              </w:rPr>
-              <w:t xml:space="preserve">Hana Ni Natte</w:t>
+                <w:sz w:val="23"/>
+                <w:szCs w:val="23"/>
+              </w:rPr>
+            </w:pPr>
+            <w:r>
+              <w:rPr>
+                <w:rFonts w:ascii="Arial Unicode MS" w:cs="Arial Unicode MS" w:eastAsia="Arial Unicode MS" w:hAnsi="Arial Unicode MS"/>
+                <w:b w:val="1"/>
+                <w:bCs w:val="1"/>
+                <w:sz w:val="23"/>
+                <w:szCs w:val="23"/>
+                <w:rtl w:val="0"/>
+              </w:rPr>
+              <w:t xml:space="preserve">Moonlight Densetsu  ムーンライト伝説</w:t>
             </w:r>
           </w:p>
           <w:p>
@@ -2595,7 +2653,7 @@
               <w:rPr>
                 <w:rtl w:val="0"/>
               </w:rPr>
-              <w:t xml:space="preserve">Shingo Anami</w:t>
+              <w:t xml:space="preserve">Tetsuya Komoro</w:t>
             </w:r>
           </w:p>
           <w:p>
@@ -2613,7 +2671,7 @@
                 <w:iCs w:val="1"/>
                 <w:rtl w:val="0"/>
               </w:rPr>
-              <w:t xml:space="preserve">Arr. Kohsuke Negishi</w:t>
+              <w:t xml:space="preserve">Arr. Yulin Ni</w:t>
             </w:r>
           </w:p>
           <w:p>
@@ -2624,74 +2682,20 @@
               <w:rPr>
                 <w:b w:val="1"/>
                 <w:bCs w:val="1"/>
-                <w:sz w:val="26"/>
-                <w:szCs w:val="26"/>
-              </w:rPr>
-            </w:pPr>
-            <w:r>
-              <w:rPr>
-                <w:b w:val="1"/>
-                <w:bCs w:val="1"/>
-                <w:sz w:val="26"/>
-                <w:szCs w:val="26"/>
-                <w:rtl w:val="0"/>
-              </w:rPr>
-              <w:t xml:space="preserve">Moonlight Densetsu</w:t>
-            </w:r>
-          </w:p>
-          <w:p>
-            <w:pPr>
-              <w:keepNext w:val="1"/>
-              <w:widowControl w:val="0"/>
-              <w:spacing w:line="240" w:lineRule="auto"/>
-              <w:rPr/>
-            </w:pPr>
-            <w:r>
-              <w:rPr>
-                <w:rtl w:val="0"/>
-              </w:rPr>
-              <w:t xml:space="preserve">Tetsuya Komoro</w:t>
-            </w:r>
-          </w:p>
-          <w:p>
-            <w:pPr>
-              <w:widowControl w:val="0"/>
-              <w:spacing w:after="290" w:line="240" w:lineRule="auto"/>
-              <w:rPr>
-                <w:i w:val="1"/>
-                <w:iCs w:val="1"/>
-              </w:rPr>
-            </w:pPr>
-            <w:r>
-              <w:rPr>
-                <w:i w:val="1"/>
-                <w:iCs w:val="1"/>
-                <w:rtl w:val="0"/>
-              </w:rPr>
-              <w:t xml:space="preserve">Arr. Yulin Ni</w:t>
-            </w:r>
-          </w:p>
-          <w:p>
-            <w:pPr>
-              <w:keepNext w:val="1"/>
-              <w:widowControl w:val="0"/>
-              <w:spacing w:line="240" w:lineRule="auto"/>
-              <w:rPr>
-                <w:b w:val="1"/>
-                <w:bCs w:val="1"/>
-                <w:sz w:val="26"/>
-                <w:szCs w:val="26"/>
-              </w:rPr>
-            </w:pPr>
-            <w:r>
-              <w:rPr>
-                <w:b w:val="1"/>
-                <w:bCs w:val="1"/>
-                <w:sz w:val="26"/>
-                <w:szCs w:val="26"/>
-                <w:rtl w:val="0"/>
-              </w:rPr>
-              <w:t xml:space="preserve">Shanghai Tan</w:t>
+                <w:sz w:val="23"/>
+                <w:szCs w:val="23"/>
+              </w:rPr>
+            </w:pPr>
+            <w:r>
+              <w:rPr>
+                <w:rFonts w:ascii="Arial Unicode MS" w:cs="Arial Unicode MS" w:eastAsia="Arial Unicode MS" w:hAnsi="Arial Unicode MS"/>
+                <w:b w:val="1"/>
+                <w:bCs w:val="1"/>
+                <w:sz w:val="23"/>
+                <w:szCs w:val="23"/>
+                <w:rtl w:val="0"/>
+              </w:rPr>
+              <w:t xml:space="preserve">Shanghai Tan  上海灘</w:t>
             </w:r>
           </w:p>
           <w:p>
@@ -2950,7 +2954,28 @@
                 <w:szCs w:val="26"/>
                 <w:rtl w:val="0"/>
               </w:rPr>
-              <w:t xml:space="preserve">The Final Day</w:t>
+              <w:t xml:space="preserve">The Final Day </w:t>
+            </w:r>
+            <w:r>
+              <w:rPr>
+                <w:rFonts w:ascii="Arial Unicode MS" w:cs="Arial Unicode MS" w:eastAsia="Arial Unicode MS" w:hAnsi="Arial Unicode MS"/>
+                <w:b w:val="1"/>
+                <w:bCs w:val="1"/>
+                <w:sz w:val="23"/>
+                <w:szCs w:val="23"/>
+                <w:rtl w:val="0"/>
+              </w:rPr>
+              <w:t xml:space="preserve">終焉の戦い</w:t>
+            </w:r>
+            <w:r>
+              <w:rPr>
+                <w:b w:val="1"/>
+                <w:bCs w:val="1"/>
+                <w:sz w:val="26"/>
+                <w:szCs w:val="26"/>
+                <w:rtl w:val="0"/>
+              </w:rPr>
+              <w:t xml:space="preserve"> </w:t>
             </w:r>
           </w:p>
           <w:p>
@@ -2993,8 +3018,186 @@
               <w:rPr>
                 <w:b w:val="1"/>
                 <w:bCs w:val="1"/>
+                <w:sz w:val="23"/>
+                <w:szCs w:val="23"/>
+              </w:rPr>
+            </w:pPr>
+            <w:r>
+              <w:rPr>
+                <w:b w:val="1"/>
+                <w:bCs w:val="1"/>
                 <w:sz w:val="26"/>
                 <w:szCs w:val="26"/>
+                <w:rtl w:val="0"/>
+              </w:rPr>
+              <w:t xml:space="preserve">Silhouette </w:t>
+            </w:r>
+            <w:r>
+              <w:rPr>
+                <w:rFonts w:ascii="Arial Unicode MS" w:cs="Arial Unicode MS" w:eastAsia="Arial Unicode MS" w:hAnsi="Arial Unicode MS"/>
+                <w:b w:val="1"/>
+                <w:bCs w:val="1"/>
+                <w:sz w:val="23"/>
+                <w:szCs w:val="23"/>
+                <w:rtl w:val="0"/>
+              </w:rPr>
+              <w:t xml:space="preserve">シルエット </w:t>
+            </w:r>
+          </w:p>
+          <w:p>
+            <w:pPr>
+              <w:keepNext w:val="1"/>
+              <w:widowControl w:val="0"/>
+              <w:spacing w:line="240" w:lineRule="auto"/>
+              <w:rPr/>
+            </w:pPr>
+            <w:r>
+              <w:rPr>
+                <w:rtl w:val="0"/>
+              </w:rPr>
+              <w:t xml:space="preserve">Maguro Taniguchi</w:t>
+            </w:r>
+          </w:p>
+          <w:p>
+            <w:pPr>
+              <w:widowControl w:val="0"/>
+              <w:spacing w:after="250" w:line="240" w:lineRule="auto"/>
+              <w:rPr>
+                <w:i w:val="1"/>
+                <w:iCs w:val="1"/>
+              </w:rPr>
+            </w:pPr>
+            <w:r>
+              <w:rPr>
+                <w:i w:val="1"/>
+                <w:iCs w:val="1"/>
+                <w:rtl w:val="0"/>
+              </w:rPr>
+              <w:t xml:space="preserve">Arr. Ko Tanaka</w:t>
+            </w:r>
+          </w:p>
+          <w:p>
+            <w:pPr>
+              <w:keepNext w:val="1"/>
+              <w:widowControl w:val="0"/>
+              <w:spacing w:line="240" w:lineRule="auto"/>
+              <w:rPr>
+                <w:b w:val="1"/>
+                <w:bCs w:val="1"/>
+                <w:sz w:val="23"/>
+                <w:szCs w:val="23"/>
+              </w:rPr>
+            </w:pPr>
+            <w:r>
+              <w:rPr>
+                <w:rFonts w:ascii="Arial Unicode MS" w:cs="Arial Unicode MS" w:eastAsia="Arial Unicode MS" w:hAnsi="Arial Unicode MS"/>
+                <w:b w:val="1"/>
+                <w:bCs w:val="1"/>
+                <w:sz w:val="23"/>
+                <w:szCs w:val="23"/>
+                <w:rtl w:val="0"/>
+              </w:rPr>
+              <w:t xml:space="preserve">Soto  外</w:t>
+            </w:r>
+          </w:p>
+          <w:p>
+            <w:pPr>
+              <w:keepNext w:val="1"/>
+              <w:widowControl w:val="0"/>
+              <w:spacing w:line="240" w:lineRule="auto"/>
+              <w:rPr/>
+            </w:pPr>
+            <w:r>
+              <w:rPr>
+                <w:rtl w:val="0"/>
+              </w:rPr>
+              <w:t xml:space="preserve">Hakushi Hasegawa</w:t>
+            </w:r>
+          </w:p>
+          <w:p>
+            <w:pPr>
+              <w:widowControl w:val="0"/>
+              <w:spacing w:after="250" w:line="240" w:lineRule="auto"/>
+              <w:rPr>
+                <w:i w:val="1"/>
+                <w:iCs w:val="1"/>
+              </w:rPr>
+            </w:pPr>
+            <w:r>
+              <w:rPr>
+                <w:i w:val="1"/>
+                <w:iCs w:val="1"/>
+                <w:rtl w:val="0"/>
+              </w:rPr>
+              <w:t xml:space="preserve">Arr. Ko Tanaka</w:t>
+            </w:r>
+          </w:p>
+          <w:p>
+            <w:pPr>
+              <w:keepNext w:val="1"/>
+              <w:widowControl w:val="0"/>
+              <w:spacing w:line="240" w:lineRule="auto"/>
+              <w:rPr>
+                <w:b w:val="1"/>
+                <w:bCs w:val="1"/>
+                <w:sz w:val="23"/>
+                <w:szCs w:val="23"/>
+              </w:rPr>
+            </w:pPr>
+            <w:r>
+              <w:rPr>
+                <w:rFonts w:ascii="Arial Unicode MS" w:cs="Arial Unicode MS" w:eastAsia="Arial Unicode MS" w:hAnsi="Arial Unicode MS"/>
+                <w:b w:val="1"/>
+                <w:bCs w:val="1"/>
+                <w:sz w:val="23"/>
+                <w:szCs w:val="23"/>
+                <w:rtl w:val="0"/>
+              </w:rPr>
+              <w:t xml:space="preserve">Floating Moon on the Water  水面月影</w:t>
+            </w:r>
+          </w:p>
+          <w:p>
+            <w:pPr>
+              <w:keepNext w:val="1"/>
+              <w:widowControl w:val="0"/>
+              <w:spacing w:line="240" w:lineRule="auto"/>
+              <w:rPr/>
+            </w:pPr>
+            <w:r>
+              <w:rPr>
+                <w:rtl w:val="0"/>
+              </w:rPr>
+              <w:t xml:space="preserve">Wei-Pin Chen</w:t>
+            </w:r>
+          </w:p>
+          <w:p>
+            <w:pPr>
+              <w:widowControl w:val="0"/>
+              <w:spacing w:after="250" w:line="240" w:lineRule="auto"/>
+              <w:rPr>
+                <w:i w:val="1"/>
+                <w:iCs w:val="1"/>
+              </w:rPr>
+            </w:pPr>
+            <w:r>
+              <w:rPr>
+                <w:i w:val="1"/>
+                <w:iCs w:val="1"/>
+                <w:rtl w:val="0"/>
+              </w:rPr>
+              <w:t xml:space="preserve">Arr. Eric Liu</w:t>
+            </w:r>
+          </w:p>
+          <w:p>
+            <w:pPr>
+              <w:keepNext w:val="1"/>
+              <w:widowControl w:val="0"/>
+              <w:spacing w:line="240" w:lineRule="auto"/>
+              <w:rPr>
+                <w:b w:val="1"/>
+                <w:bCs w:val="1"/>
+                <w:sz w:val="23"/>
+                <w:szCs w:val="23"/>
               </w:rPr>
             </w:pPr>
             <w:r>
@@ -3005,7 +3208,18 @@
                 <w:szCs w:val="26"/>
                 <w:rtl w:val="0"/>
               </w:rPr>
-              <w:t xml:space="preserve">Silhouette</w:t>
+              <w:t xml:space="preserve">Baka Mitai </w:t>
+            </w:r>
+            <w:r>
+              <w:rPr>
+                <w:rFonts w:ascii="Arial Unicode MS" w:cs="Arial Unicode MS" w:eastAsia="Arial Unicode MS" w:hAnsi="Arial Unicode MS"/>
+                <w:b w:val="1"/>
+                <w:bCs w:val="1"/>
+                <w:sz w:val="23"/>
+                <w:szCs w:val="23"/>
+                <w:rtl w:val="0"/>
+              </w:rPr>
+              <w:t xml:space="preserve">ばかみたい </w:t>
             </w:r>
           </w:p>
           <w:p>
@@ -3019,7 +3233,7 @@
               <w:rPr>
                 <w:rtl w:val="0"/>
               </w:rPr>
-              <w:t xml:space="preserve">Maguro Taniguchi</w:t>
+              <w:t xml:space="preserve">Mitsuharu Fukuyama</w:t>
             </w:r>
           </w:p>
           <w:p>
@@ -3037,7 +3251,7 @@
                 <w:iCs w:val="1"/>
                 <w:rtl w:val="0"/>
               </w:rPr>
-              <w:t xml:space="preserve">Arr. Ko Tanaka</w:t>
+              <w:t xml:space="preserve">Arr. Yulin Ni</w:t>
             </w:r>
           </w:p>
           <w:p>
@@ -3060,7 +3274,7 @@
                 <w:szCs w:val="26"/>
                 <w:rtl w:val="0"/>
               </w:rPr>
-              <w:t xml:space="preserve">Soto</w:t>
+              <w:t xml:space="preserve">Destati</w:t>
             </w:r>
           </w:p>
           <w:p>
@@ -3074,7 +3288,7 @@
               <w:rPr>
                 <w:rtl w:val="0"/>
               </w:rPr>
-              <w:t xml:space="preserve">Hakushi Hasegawa</w:t>
+              <w:t xml:space="preserve">Yoko Shimomura</w:t>
             </w:r>
           </w:p>
           <w:p>
@@ -3092,7 +3306,7 @@
                 <w:iCs w:val="1"/>
                 <w:rtl w:val="0"/>
               </w:rPr>
-              <w:t xml:space="preserve">Arr. Ko Tanaka</w:t>
+              <w:t xml:space="preserve">Arr. Joel Scianna</w:t>
             </w:r>
           </w:p>
           <w:p>
@@ -3100,187 +3314,33 @@
               <w:keepNext w:val="1"/>
               <w:widowControl w:val="0"/>
               <w:spacing w:line="240" w:lineRule="auto"/>
+              <w:rPr>
+                <w:b w:val="1"/>
+                <w:bCs w:val="1"/>
+                <w:sz w:val="23"/>
+                <w:szCs w:val="23"/>
+              </w:rPr>
+            </w:pPr>
+            <w:r>
               <w:rPr>
                 <w:b w:val="1"/>
                 <w:bCs w:val="1"/>
                 <w:sz w:val="26"/>
                 <w:szCs w:val="26"/>
-              </w:rPr>
-            </w:pPr>
-            <w:r>
-              <w:rPr>
-                <w:b w:val="1"/>
-                <w:bCs w:val="1"/>
-                <w:sz w:val="26"/>
-                <w:szCs w:val="26"/>
-                <w:rtl w:val="0"/>
-              </w:rPr>
-              <w:t xml:space="preserve">Floating Moon on the Water</w:t>
-            </w:r>
-          </w:p>
-          <w:p>
-            <w:pPr>
-              <w:keepNext w:val="1"/>
-              <w:widowControl w:val="0"/>
-              <w:spacing w:line="240" w:lineRule="auto"/>
-              <w:rPr/>
-            </w:pPr>
-            <w:r>
-              <w:rPr>
-                <w:rtl w:val="0"/>
-              </w:rPr>
-              <w:t xml:space="preserve">Wei-Pin Chen</w:t>
-            </w:r>
-          </w:p>
-          <w:p>
-            <w:pPr>
-              <w:widowControl w:val="0"/>
-              <w:spacing w:after="250" w:line="240" w:lineRule="auto"/>
-              <w:rPr>
-                <w:i w:val="1"/>
-                <w:iCs w:val="1"/>
-              </w:rPr>
-            </w:pPr>
-            <w:r>
-              <w:rPr>
-                <w:i w:val="1"/>
-                <w:iCs w:val="1"/>
-                <w:rtl w:val="0"/>
-              </w:rPr>
-              <w:t xml:space="preserve">Arr. Eric Liu</w:t>
-            </w:r>
-          </w:p>
-          <w:p>
-            <w:pPr>
-              <w:keepNext w:val="1"/>
-              <w:widowControl w:val="0"/>
-              <w:spacing w:line="240" w:lineRule="auto"/>
-              <w:rPr>
-                <w:b w:val="1"/>
-                <w:bCs w:val="1"/>
-                <w:sz w:val="26"/>
-                <w:szCs w:val="26"/>
-              </w:rPr>
-            </w:pPr>
-            <w:r>
-              <w:rPr>
-                <w:b w:val="1"/>
-                <w:bCs w:val="1"/>
-                <w:sz w:val="26"/>
-                <w:szCs w:val="26"/>
-                <w:rtl w:val="0"/>
-              </w:rPr>
-              <w:t xml:space="preserve">Baka Mitai</w:t>
-            </w:r>
-          </w:p>
-          <w:p>
-            <w:pPr>
-              <w:keepNext w:val="1"/>
-              <w:widowControl w:val="0"/>
-              <w:spacing w:line="240" w:lineRule="auto"/>
-              <w:rPr/>
-            </w:pPr>
-            <w:r>
-              <w:rPr>
-                <w:rtl w:val="0"/>
-              </w:rPr>
-              <w:t xml:space="preserve">Mitsuharu Fukuyama</w:t>
-            </w:r>
-          </w:p>
-          <w:p>
-            <w:pPr>
-              <w:widowControl w:val="0"/>
-              <w:spacing w:after="250" w:line="240" w:lineRule="auto"/>
-              <w:rPr>
-                <w:i w:val="1"/>
-                <w:iCs w:val="1"/>
-              </w:rPr>
-            </w:pPr>
-            <w:r>
-              <w:rPr>
-                <w:i w:val="1"/>
-                <w:iCs w:val="1"/>
-                <w:rtl w:val="0"/>
-              </w:rPr>
-              <w:t xml:space="preserve">Arr. Yulin Ni</w:t>
-            </w:r>
-          </w:p>
-          <w:p>
-            <w:pPr>
-              <w:keepNext w:val="1"/>
-              <w:widowControl w:val="0"/>
-              <w:spacing w:line="240" w:lineRule="auto"/>
-              <w:rPr>
-                <w:b w:val="1"/>
-                <w:bCs w:val="1"/>
-                <w:sz w:val="26"/>
-                <w:szCs w:val="26"/>
-              </w:rPr>
-            </w:pPr>
-            <w:r>
-              <w:rPr>
-                <w:b w:val="1"/>
-                <w:bCs w:val="1"/>
-                <w:sz w:val="26"/>
-                <w:szCs w:val="26"/>
-                <w:rtl w:val="0"/>
-              </w:rPr>
-              <w:t xml:space="preserve">Destati</w:t>
-            </w:r>
-          </w:p>
-          <w:p>
-            <w:pPr>
-              <w:keepNext w:val="1"/>
-              <w:widowControl w:val="0"/>
-              <w:spacing w:line="240" w:lineRule="auto"/>
-              <w:rPr/>
-            </w:pPr>
-            <w:r>
-              <w:rPr>
-                <w:rtl w:val="0"/>
-              </w:rPr>
-              <w:t xml:space="preserve">Yoko Shimomura</w:t>
-            </w:r>
-          </w:p>
-          <w:p>
-            <w:pPr>
-              <w:widowControl w:val="0"/>
-              <w:spacing w:after="250" w:line="240" w:lineRule="auto"/>
-              <w:rPr>
-                <w:i w:val="1"/>
-                <w:iCs w:val="1"/>
-              </w:rPr>
-            </w:pPr>
-            <w:r>
-              <w:rPr>
-                <w:i w:val="1"/>
-                <w:iCs w:val="1"/>
-                <w:rtl w:val="0"/>
-              </w:rPr>
-              <w:t xml:space="preserve">Arr. Joel Scianna</w:t>
-            </w:r>
-          </w:p>
-          <w:p>
-            <w:pPr>
-              <w:keepNext w:val="1"/>
-              <w:widowControl w:val="0"/>
-              <w:spacing w:line="240" w:lineRule="auto"/>
-              <w:rPr>
-                <w:b w:val="1"/>
-                <w:bCs w:val="1"/>
-                <w:sz w:val="26"/>
-                <w:szCs w:val="26"/>
-              </w:rPr>
-            </w:pPr>
-            <w:r>
-              <w:rPr>
-                <w:b w:val="1"/>
-                <w:bCs w:val="1"/>
-                <w:sz w:val="26"/>
-                <w:szCs w:val="26"/>
-                <w:rtl w:val="0"/>
-              </w:rPr>
-              <w:t xml:space="preserve">Super Smash Brothers Brawl Opening</w:t>
+                <w:rtl w:val="0"/>
+              </w:rPr>
+              <w:t xml:space="preserve">Super Smash Brothers Brawl Opening </w:t>
+            </w:r>
+            <w:r>
+              <w:rPr>
+                <w:rFonts w:ascii="Arial Unicode MS" w:cs="Arial Unicode MS" w:eastAsia="Arial Unicode MS" w:hAnsi="Arial Unicode MS"/>
+                <w:b w:val="1"/>
+                <w:bCs w:val="1"/>
+                <w:sz w:val="23"/>
+                <w:szCs w:val="23"/>
+                <w:rtl w:val="0"/>
+              </w:rPr>
+              <w:t xml:space="preserve">メインテーマ </w:t>
             </w:r>
           </w:p>
           <w:p>
@@ -3463,7 +3523,7 @@
       <w:tr>
         <w:trPr>
           <w:cantSplit w:val="0"/>
-          <w:trHeight w:val="680" w:hRule="atLeast"/>
+          <w:trHeight w:val="405" w:hRule="atLeast"/>
           <w:tblHeader w:val="0"/>
         </w:trPr>
         <w:tc>
@@ -3567,7 +3627,7 @@
       <w:tr>
         <w:trPr>
           <w:cantSplit w:val="0"/>
-          <w:trHeight w:val="640" w:hRule="atLeast"/>
+          <w:trHeight w:val="783.2298057966032" w:hRule="atLeast"/>
           <w:tblHeader w:val="0"/>
         </w:trPr>
         <w:tc>
@@ -3751,7 +3811,7 @@
       <w:tr>
         <w:trPr>
           <w:cantSplit w:val="0"/>
-          <w:trHeight w:val="640" w:hRule="atLeast"/>
+          <w:trHeight w:val="625.4248088360239" w:hRule="atLeast"/>
           <w:tblHeader w:val="0"/>
         </w:trPr>
         <w:tc>
@@ -3809,7 +3869,7 @@
                 <w:szCs w:val="21.5"/>
                 <w:rtl w:val="0"/>
               </w:rPr>
-              <w:t xml:space="preserve">Chomp Martinez Cuevas</w:t>
+              <w:t xml:space="preserve">Chomp</w:t>
             </w:r>
           </w:p>
         </w:tc>
@@ -3935,7 +3995,7 @@
       <w:tr>
         <w:trPr>
           <w:cantSplit w:val="0"/>
-          <w:trHeight w:val="640" w:hRule="atLeast"/>
+          <w:trHeight w:val="625.4248088360239" w:hRule="atLeast"/>
           <w:tblHeader w:val="0"/>
         </w:trPr>
         <w:tc>
@@ -4119,7 +4179,7 @@
       <w:tr>
         <w:trPr>
           <w:cantSplit w:val="0"/>
-          <w:trHeight w:val="640" w:hRule="atLeast"/>
+          <w:trHeight w:val="754.00634765625" w:hRule="atLeast"/>
           <w:tblHeader w:val="0"/>
         </w:trPr>
         <w:tc>
@@ -4303,7 +4363,7 @@
       <w:tr>
         <w:trPr>
           <w:cantSplit w:val="0"/>
-          <w:trHeight w:val="640" w:hRule="atLeast"/>
+          <w:trHeight w:val="1023.25927734375" w:hRule="atLeast"/>
           <w:tblHeader w:val="0"/>
         </w:trPr>
         <w:tc>
@@ -4397,6 +4457,66 @@
                 <w:szCs w:val="14.2"/>
                 <w:rtl w:val="0"/>
               </w:rPr>
+              <w:t xml:space="preserve">JOSEPH “JOJO” CHEN</w:t>
+            </w:r>
+          </w:p>
+          <w:p>
+            <w:pPr>
+              <w:widowControl w:val="0"/>
+              <w:spacing w:line="240" w:lineRule="auto"/>
+              <w:jc w:val="center"/>
+              <w:rPr>
+                <w:b w:val="1"/>
+                <w:bCs w:val="1"/>
+                <w:sz w:val="21.5"/>
+                <w:szCs w:val="21.5"/>
+              </w:rPr>
+            </w:pPr>
+            <w:r>
+              <w:rPr>
+                <w:b w:val="1"/>
+                <w:bCs w:val="1"/>
+                <w:sz w:val="21.5"/>
+                <w:szCs w:val="21.5"/>
+                <w:rtl w:val="0"/>
+              </w:rPr>
+              <w:t xml:space="preserve">Abraham “AJ” Lopez</w:t>
+            </w:r>
+          </w:p>
+          <w:p>
+            <w:pPr>
+              <w:widowControl w:val="0"/>
+              <w:spacing w:line="240" w:lineRule="auto"/>
+              <w:jc w:val="center"/>
+              <w:rPr>
+                <w:b w:val="1"/>
+                <w:bCs w:val="1"/>
+                <w:sz w:val="21.5"/>
+                <w:szCs w:val="21.5"/>
+              </w:rPr>
+            </w:pPr>
+            <w:r>
+              <w:rPr>
+                <w:rtl w:val="0"/>
+              </w:rPr>
+            </w:r>
+          </w:p>
+          <w:p>
+            <w:pPr>
+              <w:widowControl w:val="0"/>
+              <w:spacing w:after="60" w:line="240" w:lineRule="auto"/>
+              <w:jc w:val="center"/>
+              <w:rPr>
+                <w:sz w:val="14.2"/>
+                <w:szCs w:val="14.2"/>
+              </w:rPr>
+            </w:pPr>
+            <w:r>
+              <w:rPr>
+                <w:sz w:val="14.2"/>
+                <w:szCs w:val="14.2"/>
+                <w:rtl w:val="0"/>
+              </w:rPr>
               <w:t xml:space="preserve">BARTHOLEMEW BARTHANDELUS</w:t>
             </w:r>
           </w:p>
@@ -4487,7 +4607,7 @@
       <w:tr>
         <w:trPr>
           <w:cantSplit w:val="0"/>
-          <w:trHeight w:val="640" w:hRule="atLeast"/>
+          <w:trHeight w:val="625.4248088360239" w:hRule="atLeast"/>
           <w:tblHeader w:val="0"/>
         </w:trPr>
         <w:tc>
@@ -4671,7 +4791,7 @@
       <w:tr>
         <w:trPr>
           <w:cantSplit w:val="0"/>
-          <w:trHeight w:val="640" w:hRule="atLeast"/>
+          <w:trHeight w:val="510" w:hRule="atLeast"/>
           <w:tblHeader w:val="0"/>
         </w:trPr>
         <w:tc>
@@ -4729,7 +4849,7 @@
                 <w:szCs w:val="21.5"/>
                 <w:rtl w:val="0"/>
               </w:rPr>
-              <w:t xml:space="preserve">Abraham Lopez</w:t>
+              <w:t xml:space="preserve">Abraham “AJ” Lopez</w:t>
             </w:r>
           </w:p>
         </w:tc>
@@ -4855,7 +4975,7 @@
       <w:tr>
         <w:trPr>
           <w:cantSplit w:val="0"/>
-          <w:trHeight w:val="640" w:hRule="atLeast"/>
+          <w:trHeight w:val="625.4248088360239" w:hRule="atLeast"/>
           <w:tblHeader w:val="0"/>
         </w:trPr>
         <w:tc>
@@ -4972,7 +5092,7 @@
                 <w:szCs w:val="21.5"/>
                 <w:rtl w:val="0"/>
               </w:rPr>
-              <w:t xml:space="preserve">Abraham Lopez</w:t>
+              <w:t xml:space="preserve">Abraham “AJ” Lopez</w:t>
             </w:r>
           </w:p>
         </w:tc>
@@ -5039,7 +5159,7 @@
       <w:tr>
         <w:trPr>
           <w:cantSplit w:val="0"/>
-          <w:trHeight w:val="640" w:hRule="atLeast"/>
+          <w:trHeight w:val="760.9297297184655" w:hRule="atLeast"/>
           <w:tblHeader w:val="0"/>
         </w:trPr>
         <w:tc>
@@ -5223,7 +5343,7 @@
       <w:tr>
         <w:trPr>
           <w:cantSplit w:val="0"/>
-          <w:trHeight w:val="640" w:hRule="atLeast"/>
+          <w:trHeight w:val="760.9297297184655" w:hRule="atLeast"/>
           <w:tblHeader w:val="0"/>
         </w:trPr>
         <w:tc>
@@ -5452,7 +5572,7 @@
             <wp:extent cx="1118409" cy="1939582"/>
             <wp:effectExtent b="0" l="0" r="0" t="0"/>
             <wp:wrapNone/>
-            <wp:docPr id="2" name="image5.png"/>
+            <wp:docPr id="3" name="image5.png"/>
             <a:graphic>
               <a:graphicData uri="http://schemas.openxmlformats.org/drawingml/2006/picture">
                 <pic:pic>
@@ -5494,12 +5614,12 @@
             <wp:extent cx="1576388" cy="1124187"/>
             <wp:effectExtent b="0" l="0" r="0" t="0"/>
             <wp:wrapNone/>
-            <wp:docPr id="3" name="image1.png"/>
+            <wp:docPr id="2" name="image3.png"/>
             <a:graphic>
               <a:graphicData uri="http://schemas.openxmlformats.org/drawingml/2006/picture">
                 <pic:pic>
                   <pic:nvPicPr>
-                    <pic:cNvPr id="0" name="image1.png"/>
+                    <pic:cNvPr id="0" name="image3.png"/>
                     <pic:cNvPicPr preferRelativeResize="0"/>
                   </pic:nvPicPr>
                   <pic:blipFill>
@@ -5536,12 +5656,12 @@
             <wp:extent cx="1157288" cy="850537"/>
             <wp:effectExtent b="0" l="0" r="0" t="0"/>
             <wp:wrapNone/>
-            <wp:docPr id="6" name="image4.jpg"/>
+            <wp:docPr id="5" name="image2.jpg"/>
             <a:graphic>
               <a:graphicData uri="http://schemas.openxmlformats.org/drawingml/2006/picture">
                 <pic:pic>
                   <pic:nvPicPr>
-                    <pic:cNvPr id="0" name="image4.jpg"/>
+                    <pic:cNvPr id="0" name="image2.jpg"/>
                     <pic:cNvPicPr preferRelativeResize="0"/>
                   </pic:nvPicPr>
                   <pic:blipFill>
@@ -5587,26 +5707,6 @@
       <w:pPr>
         <w:spacing w:before="1100" w:line="240" w:lineRule="auto"/>
         <w:jc w:val="center"/>
-        <w:rPr>
-          <w:b w:val="1"/>
-          <w:bCs w:val="1"/>
-          <w:sz w:val="18"/>
-          <w:szCs w:val="18"/>
-        </w:rPr>
-      </w:pPr>
-      <w:r>
-        <w:rPr>
-          <w:b w:val="1"/>
-          <w:bCs w:val="1"/>
-          <w:sz w:val="18"/>
-          <w:szCs w:val="18"/>
-          <w:rtl w:val="0"/>
-        </w:rPr>
-        <w:t xml:space="preserve">No generative AI was used to create this show.</w:t>
-      </w:r>
-    </w:p>
-    <w:p>
-      <w:pPr>
         <w:rPr/>
         <w:sectPr>
           <w:headerReference r:id="rId24" w:type="default"/>
@@ -5615,6 +5715,16 @@
           <w:pgMar w:bottom="1440" w:top="1440" w:left="1440" w:right="1440" w:header="720" w:footer="720"/>
         </w:sectPr>
       </w:pPr>
+      <w:r>
+        <w:rPr>
+          <w:b w:val="1"/>
+          <w:bCs w:val="1"/>
+          <w:sz w:val="18"/>
+          <w:szCs w:val="18"/>
+          <w:rtl w:val="0"/>
+        </w:rPr>
+        <w:t xml:space="preserve">No generative AI was used to create this show.</w:t>
+      </w:r>
       <w:r>
         <w:rPr>
           <w:rtl w:val="0"/>
@@ -5648,7 +5758,7 @@
           <w:pgNumType w:start="1"/>
         </w:sectPr>
       </w:pPr>
-      <w:bookmarkStart w:colFirst="0" w:colLast="0" w:name="_hvdyz39sv0jx" w:id="1"/>
+      <w:bookmarkStart w:colFirst="0" w:colLast="0" w:name="_gn2tc05kjlbx" w:id="1"/>
       <w:bookmarkEnd w:id="1"/>
       <w:r>
         <w:rPr>
@@ -5803,12 +5913,12 @@
             <wp:extent cx="2644915" cy="1666875"/>
             <wp:effectExtent b="0" l="0" r="0" t="0"/>
             <wp:wrapNone/>
-            <wp:docPr id="5" name="image2.png"/>
+            <wp:docPr id="4" name="image1.png"/>
             <a:graphic>
               <a:graphicData uri="http://schemas.openxmlformats.org/drawingml/2006/picture">
                 <pic:pic>
                   <pic:nvPicPr>
-                    <pic:cNvPr id="0" name="image2.png"/>
+                    <pic:cNvPr id="0" name="image1.png"/>
                     <pic:cNvPicPr preferRelativeResize="0"/>
                   </pic:nvPicPr>
                   <pic:blipFill>
@@ -7276,7 +7386,7 @@
                 <w:szCs w:val="17"/>
                 <w:rtl w:val="0"/>
               </w:rPr>
-              <w:t xml:space="preserve">Ultima materia comes out of the Earth. The Crown controls the mines, the research and the weapons built from it. When workers in New Jersey refused extraction orders, the Crown called their resistance a threat to “continuity.”</w:t>
+              <w:t xml:space="preserve">Ultima ore comes out of the Earth. The Crown controls the mines, the research and the weapons built from it. When workers in New Jersey refused extraction orders, the Crown called their resistance a threat to “continuity.”</w:t>
             </w:r>
           </w:p>
           <w:p>
@@ -7587,7 +7697,7 @@
                 <w:szCs w:val="17"/>
                 <w:rtl w:val="0"/>
               </w:rPr>
-              <w:t xml:space="preserve">RUSH CRATER PHO</w:t>
+              <w:t xml:space="preserve">Absolute Pho-nema</w:t>
             </w:r>
           </w:p>
           <w:p>
@@ -7655,7 +7765,7 @@
                 <w:szCs w:val="17"/>
                 <w:rtl w:val="0"/>
               </w:rPr>
-              <w:t xml:space="preserve"> @rushcraterpho</w:t>
+              <w:t xml:space="preserve"> @PhoNemaRushCrater</w:t>
             </w:r>
           </w:p>
         </w:tc>
@@ -8170,6 +8280,36 @@
               <w:t xml:space="preserve">Fresh cabbages. Need Ultima ore for our Earth transport. No questions asked.</w:t>
             </w:r>
           </w:p>
+          <w:p>
+            <w:pPr>
+              <w:widowControl w:val="0"/>
+              <w:spacing w:line="227.99999999999997" w:lineRule="auto"/>
+              <w:rPr>
+                <w:sz w:val="17"/>
+                <w:szCs w:val="17"/>
+              </w:rPr>
+            </w:pPr>
+            <w:r>
+              <w:rPr>
+                <w:rtl w:val="0"/>
+              </w:rPr>
+            </w:r>
+          </w:p>
+          <w:p>
+            <w:pPr>
+              <w:widowControl w:val="0"/>
+              <w:spacing w:line="227.99999999999997" w:lineRule="auto"/>
+              <w:rPr>
+                <w:sz w:val="17"/>
+                <w:szCs w:val="17"/>
+              </w:rPr>
+            </w:pPr>
+            <w:r>
+              <w:rPr>
+                <w:rtl w:val="0"/>
+              </w:rPr>
+            </w:r>
+          </w:p>
         </w:tc>
         <w:tc>
           <w:tcPr/>
@@ -8302,28 +8442,7 @@
                 <w:szCs w:val="17"/>
                 <w:rtl w:val="0"/>
               </w:rPr>
-              <w:t xml:space="preserve">COMMUNITY NOTICE: </w:t>
-            </w:r>
-            <w:r>
-              <w:rPr>
-                <w:b w:val="1"/>
-                <w:bCs w:val="1"/>
-                <w:sz w:val="17"/>
-                <w:szCs w:val="17"/>
-                <w:highlight w:val="black"/>
-                <w:rtl w:val="0"/>
-              </w:rPr>
-              <w:t xml:space="preserve">GEORGE SANDERS</w:t>
-            </w:r>
-            <w:r>
-              <w:rPr>
-                <w:b w:val="1"/>
-                <w:bCs w:val="1"/>
-                <w:sz w:val="17"/>
-                <w:szCs w:val="17"/>
-                <w:rtl w:val="0"/>
-              </w:rPr>
-              <w:t xml:space="preserve"> IS PLANETIST</w:t>
+              <w:t xml:space="preserve">COMMUNITY NOTICE:STAND UP TO PLANETISM</w:t>
             </w:r>
           </w:p>
           <w:p>
@@ -8341,7 +8460,7 @@
                 <w:szCs w:val="17"/>
                 <w:rtl w:val="0"/>
               </w:rPr>
-              <w:t xml:space="preserve">He may be friends with the Kitadani girl but he’s Earthborn through and through. Do NOT trust him. ADMIN NOTE - we redacted the name of the accused so as to not attract attention from the Academy. </w:t>
+              <w:t xml:space="preserve">Do NOT let these Earth Borns run you over! STAND UP FOR YOURSELF. WE built these colonies THEY are visitors, period. </w:t>
             </w:r>
           </w:p>
         </w:tc>

</xml_diff>

<commit_message>
remove space from end of filename, which upset windows
</commit_message>
<xml_diff>
--- a/game/assets/Program Booklet/OO2 Program.docx
+++ b/game/assets/Program Booklet/OO2 Program.docx
@@ -41,7 +41,7 @@
           <w:pgNumType w:start="1"/>
         </w:sectPr>
       </w:pPr>
-      <w:bookmarkStart w:colFirst="0" w:colLast="0" w:name="_y1ux8l470f54" w:id="0"/>
+      <w:bookmarkStart w:colFirst="0" w:colLast="0" w:name="_j4iovwshcb39" w:id="0"/>
       <w:bookmarkEnd w:id="0"/>
       <w:r>
         <w:rPr>
@@ -92,12 +92,12 @@
             <wp:extent cx="5943600" cy="3302000"/>
             <wp:effectExtent b="0" l="0" r="0" t="0"/>
             <wp:wrapNone/>
-            <wp:docPr id="9" name="image5.png"/>
+            <wp:docPr id="3" name="image3.png"/>
             <a:graphic>
               <a:graphicData uri="http://schemas.openxmlformats.org/drawingml/2006/picture">
                 <pic:pic>
                   <pic:nvPicPr>
-                    <pic:cNvPr id="0" name="image5.png"/>
+                    <pic:cNvPr id="0" name="image3.png"/>
                     <pic:cNvPicPr preferRelativeResize="0"/>
                   </pic:nvPicPr>
                   <pic:blipFill>
@@ -479,12 +479,12 @@
                 <wp:extent cx="8158163" cy="5870761"/>
                 <wp:effectExtent b="0" l="0" r="0" t="0"/>
                 <wp:wrapNone/>
-                <wp:docPr id="1" name="image9.png"/>
+                <wp:docPr id="1" name="image10.png"/>
                 <a:graphic>
                   <a:graphicData uri="http://schemas.openxmlformats.org/drawingml/2006/picture">
                     <pic:pic>
                       <pic:nvPicPr>
-                        <pic:cNvPr id="0" name="image9.png"/>
+                        <pic:cNvPr id="0" name="image10.png"/>
                         <pic:cNvPicPr preferRelativeResize="0"/>
                       </pic:nvPicPr>
                       <pic:blipFill>
@@ -2245,7 +2245,7 @@
                 <w:szCs w:val="20"/>
                 <w:rtl w:val="0"/>
               </w:rPr>
-              <w:t xml:space="preserve">Jibi J</w:t>
+              <w:t xml:space="preserve">Jibi J, Kara Lui</w:t>
             </w:r>
           </w:p>
           <w:p>
@@ -3544,9 +3544,9 @@
               <w:right w:color="000000" w:space="0" w:sz="0" w:val="nil"/>
             </w:tcBorders>
             <w:tcMar>
-              <w:top w:w="40.0" w:type="dxa"/>
+              <w:top w:w="20.0" w:type="dxa"/>
               <w:left w:w="80.0" w:type="dxa"/>
-              <w:bottom w:w="40.0" w:type="dxa"/>
+              <w:bottom w:w="20.0" w:type="dxa"/>
               <w:right w:w="80.0" w:type="dxa"/>
             </w:tcMar>
             <w:vAlign w:val="center"/>
@@ -3554,7 +3554,7 @@
           <w:p>
             <w:pPr>
               <w:widowControl w:val="0"/>
-              <w:spacing w:line="240" w:lineRule="auto"/>
+              <w:spacing w:line="211.20000000000002" w:lineRule="auto"/>
               <w:jc w:val="center"/>
               <w:rPr>
                 <w:b w:val="1"/>
@@ -3647,9 +3647,9 @@
               <w:right w:color="000000" w:space="0" w:sz="0" w:val="nil"/>
             </w:tcBorders>
             <w:tcMar>
-              <w:top w:w="40.0" w:type="dxa"/>
+              <w:top w:w="20.0" w:type="dxa"/>
               <w:left w:w="80.0" w:type="dxa"/>
-              <w:bottom w:w="40.0" w:type="dxa"/>
+              <w:bottom w:w="20.0" w:type="dxa"/>
               <w:right w:w="80.0" w:type="dxa"/>
             </w:tcMar>
             <w:vAlign w:val="center"/>
@@ -3657,7 +3657,7 @@
           <w:p>
             <w:pPr>
               <w:widowControl w:val="0"/>
-              <w:spacing w:after="60" w:line="240" w:lineRule="auto"/>
+              <w:spacing w:after="60" w:line="211.20000000000002" w:lineRule="auto"/>
               <w:jc w:val="center"/>
               <w:rPr>
                 <w:sz w:val="14.2"/>
@@ -3676,7 +3676,7 @@
           <w:p>
             <w:pPr>
               <w:widowControl w:val="0"/>
-              <w:spacing w:line="240" w:lineRule="auto"/>
+              <w:spacing w:line="211.20000000000002" w:lineRule="auto"/>
               <w:jc w:val="center"/>
               <w:rPr>
                 <w:b w:val="1"/>
@@ -3706,9 +3706,9 @@
               <w:right w:color="000000" w:space="0" w:sz="0" w:val="nil"/>
             </w:tcBorders>
             <w:tcMar>
-              <w:top w:w="40.0" w:type="dxa"/>
+              <w:top w:w="20.0" w:type="dxa"/>
               <w:left w:w="80.0" w:type="dxa"/>
-              <w:bottom w:w="40.0" w:type="dxa"/>
+              <w:bottom w:w="20.0" w:type="dxa"/>
               <w:right w:w="80.0" w:type="dxa"/>
             </w:tcMar>
             <w:vAlign w:val="center"/>
@@ -3716,7 +3716,7 @@
           <w:p>
             <w:pPr>
               <w:widowControl w:val="0"/>
-              <w:spacing w:after="60" w:line="240" w:lineRule="auto"/>
+              <w:spacing w:after="60" w:line="211.20000000000002" w:lineRule="auto"/>
               <w:jc w:val="center"/>
               <w:rPr>
                 <w:sz w:val="14.2"/>
@@ -3735,7 +3735,7 @@
           <w:p>
             <w:pPr>
               <w:widowControl w:val="0"/>
-              <w:spacing w:line="240" w:lineRule="auto"/>
+              <w:spacing w:line="211.20000000000002" w:lineRule="auto"/>
               <w:jc w:val="center"/>
               <w:rPr>
                 <w:b w:val="1"/>
@@ -3765,9 +3765,9 @@
               <w:right w:color="000000" w:space="0" w:sz="0" w:val="nil"/>
             </w:tcBorders>
             <w:tcMar>
-              <w:top w:w="40.0" w:type="dxa"/>
+              <w:top w:w="20.0" w:type="dxa"/>
               <w:left w:w="80.0" w:type="dxa"/>
-              <w:bottom w:w="40.0" w:type="dxa"/>
+              <w:bottom w:w="20.0" w:type="dxa"/>
               <w:right w:w="80.0" w:type="dxa"/>
             </w:tcMar>
             <w:vAlign w:val="center"/>
@@ -3775,7 +3775,7 @@
           <w:p>
             <w:pPr>
               <w:widowControl w:val="0"/>
-              <w:spacing w:after="60" w:line="240" w:lineRule="auto"/>
+              <w:spacing w:after="60" w:line="211.20000000000002" w:lineRule="auto"/>
               <w:jc w:val="center"/>
               <w:rPr>
                 <w:sz w:val="14.2"/>
@@ -3794,7 +3794,7 @@
           <w:p>
             <w:pPr>
               <w:widowControl w:val="0"/>
-              <w:spacing w:line="240" w:lineRule="auto"/>
+              <w:spacing w:line="211.20000000000002" w:lineRule="auto"/>
               <w:jc w:val="center"/>
               <w:rPr>
                 <w:b w:val="1"/>
@@ -3819,7 +3819,7 @@
       <w:tr>
         <w:trPr>
           <w:cantSplit w:val="0"/>
-          <w:trHeight w:val="625.4248088360239" w:hRule="atLeast"/>
+          <w:trHeight w:val="630" w:hRule="atLeast"/>
           <w:tblHeader w:val="0"/>
         </w:trPr>
         <w:tc>
@@ -3831,9 +3831,9 @@
               <w:right w:color="000000" w:space="0" w:sz="0" w:val="nil"/>
             </w:tcBorders>
             <w:tcMar>
-              <w:top w:w="40.0" w:type="dxa"/>
+              <w:top w:w="20.0" w:type="dxa"/>
               <w:left w:w="80.0" w:type="dxa"/>
-              <w:bottom w:w="40.0" w:type="dxa"/>
+              <w:bottom w:w="20.0" w:type="dxa"/>
               <w:right w:w="80.0" w:type="dxa"/>
             </w:tcMar>
             <w:vAlign w:val="center"/>
@@ -3890,9 +3890,9 @@
               <w:right w:color="000000" w:space="0" w:sz="0" w:val="nil"/>
             </w:tcBorders>
             <w:tcMar>
-              <w:top w:w="40.0" w:type="dxa"/>
+              <w:top w:w="20.0" w:type="dxa"/>
               <w:left w:w="80.0" w:type="dxa"/>
-              <w:bottom w:w="40.0" w:type="dxa"/>
+              <w:bottom w:w="20.0" w:type="dxa"/>
               <w:right w:w="80.0" w:type="dxa"/>
             </w:tcMar>
             <w:vAlign w:val="center"/>
@@ -3949,9 +3949,9 @@
               <w:right w:color="000000" w:space="0" w:sz="0" w:val="nil"/>
             </w:tcBorders>
             <w:tcMar>
-              <w:top w:w="40.0" w:type="dxa"/>
+              <w:top w:w="20.0" w:type="dxa"/>
               <w:left w:w="80.0" w:type="dxa"/>
-              <w:bottom w:w="40.0" w:type="dxa"/>
+              <w:bottom w:w="20.0" w:type="dxa"/>
               <w:right w:w="80.0" w:type="dxa"/>
             </w:tcMar>
             <w:vAlign w:val="center"/>
@@ -4003,7 +4003,7 @@
       <w:tr>
         <w:trPr>
           <w:cantSplit w:val="0"/>
-          <w:trHeight w:val="625.4248088360239" w:hRule="atLeast"/>
+          <w:trHeight w:val="630" w:hRule="atLeast"/>
           <w:tblHeader w:val="0"/>
         </w:trPr>
         <w:tc>
@@ -4015,9 +4015,9 @@
               <w:right w:color="000000" w:space="0" w:sz="0" w:val="nil"/>
             </w:tcBorders>
             <w:tcMar>
-              <w:top w:w="40.0" w:type="dxa"/>
+              <w:top w:w="20.0" w:type="dxa"/>
               <w:left w:w="80.0" w:type="dxa"/>
-              <w:bottom w:w="40.0" w:type="dxa"/>
+              <w:bottom w:w="20.0" w:type="dxa"/>
               <w:right w:w="80.0" w:type="dxa"/>
             </w:tcMar>
             <w:vAlign w:val="center"/>
@@ -4074,9 +4074,9 @@
               <w:right w:color="000000" w:space="0" w:sz="0" w:val="nil"/>
             </w:tcBorders>
             <w:tcMar>
-              <w:top w:w="40.0" w:type="dxa"/>
+              <w:top w:w="20.0" w:type="dxa"/>
               <w:left w:w="80.0" w:type="dxa"/>
-              <w:bottom w:w="40.0" w:type="dxa"/>
+              <w:bottom w:w="20.0" w:type="dxa"/>
               <w:right w:w="80.0" w:type="dxa"/>
             </w:tcMar>
             <w:vAlign w:val="center"/>
@@ -4133,9 +4133,9 @@
               <w:right w:color="000000" w:space="0" w:sz="0" w:val="nil"/>
             </w:tcBorders>
             <w:tcMar>
-              <w:top w:w="40.0" w:type="dxa"/>
+              <w:top w:w="20.0" w:type="dxa"/>
               <w:left w:w="80.0" w:type="dxa"/>
-              <w:bottom w:w="40.0" w:type="dxa"/>
+              <w:bottom w:w="20.0" w:type="dxa"/>
               <w:right w:w="80.0" w:type="dxa"/>
             </w:tcMar>
             <w:vAlign w:val="center"/>
@@ -4187,7 +4187,7 @@
       <w:tr>
         <w:trPr>
           <w:cantSplit w:val="0"/>
-          <w:trHeight w:val="754.00634765625" w:hRule="atLeast"/>
+          <w:trHeight w:val="630" w:hRule="atLeast"/>
           <w:tblHeader w:val="0"/>
         </w:trPr>
         <w:tc>
@@ -4199,9 +4199,9 @@
               <w:right w:color="000000" w:space="0" w:sz="0" w:val="nil"/>
             </w:tcBorders>
             <w:tcMar>
-              <w:top w:w="40.0" w:type="dxa"/>
+              <w:top w:w="20.0" w:type="dxa"/>
               <w:left w:w="80.0" w:type="dxa"/>
-              <w:bottom w:w="40.0" w:type="dxa"/>
+              <w:bottom w:w="20.0" w:type="dxa"/>
               <w:right w:w="80.0" w:type="dxa"/>
             </w:tcMar>
             <w:vAlign w:val="center"/>
@@ -4209,43 +4209,20 @@
           <w:p>
             <w:pPr>
               <w:widowControl w:val="0"/>
-              <w:spacing w:after="60" w:line="240" w:lineRule="auto"/>
-              <w:jc w:val="center"/>
-              <w:rPr>
-                <w:sz w:val="14.2"/>
-                <w:szCs w:val="14.2"/>
-              </w:rPr>
-            </w:pPr>
-            <w:r>
-              <w:rPr>
-                <w:sz w:val="14.2"/>
-                <w:szCs w:val="14.2"/>
-                <w:rtl w:val="0"/>
-              </w:rPr>
-              <w:t xml:space="preserve">PROFESSOR KELISHA</w:t>
-            </w:r>
-          </w:p>
-          <w:p>
-            <w:pPr>
-              <w:widowControl w:val="0"/>
               <w:spacing w:line="240" w:lineRule="auto"/>
               <w:jc w:val="center"/>
               <w:rPr>
-                <w:b w:val="1"/>
-                <w:bCs w:val="1"/>
-                <w:sz w:val="21.5"/>
-                <w:szCs w:val="21.5"/>
-              </w:rPr>
-            </w:pPr>
-            <w:r>
-              <w:rPr>
-                <w:b w:val="1"/>
-                <w:bCs w:val="1"/>
-                <w:sz w:val="21.5"/>
-                <w:szCs w:val="21.5"/>
-                <w:rtl w:val="0"/>
-              </w:rPr>
-              <w:t xml:space="preserve">Ashley Foster</w:t>
+                <w:sz w:val="13.4"/>
+                <w:szCs w:val="13.4"/>
+              </w:rPr>
+            </w:pPr>
+            <w:r>
+              <w:rPr>
+                <w:sz w:val="13.4"/>
+                <w:szCs w:val="13.4"/>
+                <w:rtl w:val="0"/>
+              </w:rPr>
+              <w:t xml:space="preserve">PROFESSOR KELISHA</w:t>
             </w:r>
           </w:p>
           <w:p>
@@ -4256,8 +4233,73 @@
               <w:rPr>
                 <w:b w:val="1"/>
                 <w:bCs w:val="1"/>
-                <w:sz w:val="21.5"/>
-                <w:szCs w:val="21.5"/>
+                <w:sz w:val="20.5"/>
+                <w:szCs w:val="20.5"/>
+              </w:rPr>
+            </w:pPr>
+            <w:r>
+              <w:rPr>
+                <w:b w:val="1"/>
+                <w:bCs w:val="1"/>
+                <w:sz w:val="20.5"/>
+                <w:szCs w:val="20.5"/>
+                <w:rtl w:val="0"/>
+              </w:rPr>
+              <w:t xml:space="preserve">Ashley Foster</w:t>
+            </w:r>
+          </w:p>
+          <w:p>
+            <w:pPr>
+              <w:widowControl w:val="0"/>
+              <w:spacing w:before="80" w:line="240" w:lineRule="auto"/>
+              <w:jc w:val="center"/>
+              <w:rPr>
+                <w:sz w:val="12"/>
+                <w:szCs w:val="12"/>
+              </w:rPr>
+            </w:pPr>
+            <w:r>
+              <w:rPr>
+                <w:sz w:val="12"/>
+                <w:szCs w:val="12"/>
+                <w:rtl w:val="0"/>
+              </w:rPr>
+              <w:t xml:space="preserve">NEWS REPORTER #2 • GOSSIPING STUDENT #2</w:t>
+            </w:r>
+          </w:p>
+          <w:p>
+            <w:pPr>
+              <w:widowControl w:val="0"/>
+              <w:spacing w:line="240" w:lineRule="auto"/>
+              <w:jc w:val="center"/>
+              <w:rPr>
+                <w:b w:val="1"/>
+                <w:bCs w:val="1"/>
+                <w:sz w:val="20.5"/>
+                <w:szCs w:val="20.5"/>
+              </w:rPr>
+            </w:pPr>
+            <w:r>
+              <w:rPr>
+                <w:b w:val="1"/>
+                <w:bCs w:val="1"/>
+                <w:sz w:val="20.5"/>
+                <w:szCs w:val="20.5"/>
+                <w:rtl w:val="0"/>
+              </w:rPr>
+              <w:t xml:space="preserve">Ashley Mendez</w:t>
+            </w:r>
+          </w:p>
+          <w:p>
+            <w:pPr>
+              <w:widowControl w:val="0"/>
+              <w:spacing w:line="240" w:lineRule="auto"/>
+              <w:jc w:val="center"/>
+              <w:rPr>
+                <w:b w:val="1"/>
+                <w:bCs w:val="1"/>
+                <w:sz w:val="20.5"/>
+                <w:szCs w:val="20.5"/>
               </w:rPr>
             </w:pPr>
             <w:r>
@@ -4276,9 +4318,9 @@
               <w:right w:color="000000" w:space="0" w:sz="0" w:val="nil"/>
             </w:tcBorders>
             <w:tcMar>
-              <w:top w:w="40.0" w:type="dxa"/>
+              <w:top w:w="20.0" w:type="dxa"/>
               <w:left w:w="80.0" w:type="dxa"/>
-              <w:bottom w:w="40.0" w:type="dxa"/>
+              <w:bottom w:w="20.0" w:type="dxa"/>
               <w:right w:w="80.0" w:type="dxa"/>
             </w:tcMar>
             <w:vAlign w:val="center"/>
@@ -4286,40 +4328,40 @@
           <w:p>
             <w:pPr>
               <w:widowControl w:val="0"/>
-              <w:spacing w:after="60" w:line="240" w:lineRule="auto"/>
-              <w:jc w:val="center"/>
-              <w:rPr>
-                <w:sz w:val="11.6"/>
-                <w:szCs w:val="11.6"/>
-              </w:rPr>
-            </w:pPr>
-            <w:r>
-              <w:rPr>
-                <w:sz w:val="11.6"/>
-                <w:szCs w:val="11.6"/>
-                <w:rtl w:val="0"/>
-              </w:rPr>
-              <w:t xml:space="preserve">NEWS REPORTER #1 • GOSSIPING STUDENT #1 • TRAIN SECURITY GUARD • FIRST OFFICER</w:t>
-            </w:r>
-          </w:p>
-          <w:p>
-            <w:pPr>
-              <w:widowControl w:val="0"/>
               <w:spacing w:line="240" w:lineRule="auto"/>
               <w:jc w:val="center"/>
               <w:rPr>
-                <w:b w:val="1"/>
-                <w:bCs w:val="1"/>
-                <w:sz w:val="21.5"/>
-                <w:szCs w:val="21.5"/>
-              </w:rPr>
-            </w:pPr>
-            <w:r>
-              <w:rPr>
-                <w:b w:val="1"/>
-                <w:bCs w:val="1"/>
-                <w:sz w:val="21.5"/>
-                <w:szCs w:val="21.5"/>
+                <w:sz w:val="13.4"/>
+                <w:szCs w:val="13.4"/>
+              </w:rPr>
+            </w:pPr>
+            <w:r>
+              <w:rPr>
+                <w:sz w:val="13.4"/>
+                <w:szCs w:val="13.4"/>
+                <w:rtl w:val="0"/>
+              </w:rPr>
+              <w:t xml:space="preserve">NEWS REPORTER #1 • GOSSIPING STUDENT #1 • TRAIN SECURITY GUARD • FIRST OFFICER</w:t>
+            </w:r>
+          </w:p>
+          <w:p>
+            <w:pPr>
+              <w:widowControl w:val="0"/>
+              <w:spacing w:line="240" w:lineRule="auto"/>
+              <w:jc w:val="center"/>
+              <w:rPr>
+                <w:b w:val="1"/>
+                <w:bCs w:val="1"/>
+                <w:sz w:val="20.5"/>
+                <w:szCs w:val="20.5"/>
+              </w:rPr>
+            </w:pPr>
+            <w:r>
+              <w:rPr>
+                <w:b w:val="1"/>
+                <w:bCs w:val="1"/>
+                <w:sz w:val="20.5"/>
+                <w:szCs w:val="20.5"/>
                 <w:rtl w:val="0"/>
               </w:rPr>
               <w:t xml:space="preserve">Felicity Audet</w:t>
@@ -4335,9 +4377,9 @@
               <w:right w:color="000000" w:space="0" w:sz="0" w:val="nil"/>
             </w:tcBorders>
             <w:tcMar>
-              <w:top w:w="40.0" w:type="dxa"/>
+              <w:top w:w="20.0" w:type="dxa"/>
               <w:left w:w="80.0" w:type="dxa"/>
-              <w:bottom w:w="40.0" w:type="dxa"/>
+              <w:bottom w:w="20.0" w:type="dxa"/>
               <w:right w:w="80.0" w:type="dxa"/>
             </w:tcMar>
             <w:vAlign w:val="center"/>
@@ -4345,40 +4387,40 @@
           <w:p>
             <w:pPr>
               <w:widowControl w:val="0"/>
-              <w:spacing w:after="60" w:line="240" w:lineRule="auto"/>
-              <w:jc w:val="center"/>
-              <w:rPr>
-                <w:sz w:val="11.6"/>
-                <w:szCs w:val="11.6"/>
-              </w:rPr>
-            </w:pPr>
-            <w:r>
-              <w:rPr>
-                <w:sz w:val="11.6"/>
-                <w:szCs w:val="11.6"/>
-                <w:rtl w:val="0"/>
-              </w:rPr>
-              <w:t xml:space="preserve">NAVIGATION CHIEF • NEWS REPORTER #3 • GOSSIPING STUDENT #3</w:t>
-            </w:r>
-          </w:p>
-          <w:p>
-            <w:pPr>
-              <w:widowControl w:val="0"/>
               <w:spacing w:line="240" w:lineRule="auto"/>
               <w:jc w:val="center"/>
               <w:rPr>
-                <w:b w:val="1"/>
-                <w:bCs w:val="1"/>
-                <w:sz w:val="21.5"/>
-                <w:szCs w:val="21.5"/>
-              </w:rPr>
-            </w:pPr>
-            <w:r>
-              <w:rPr>
-                <w:b w:val="1"/>
-                <w:bCs w:val="1"/>
-                <w:sz w:val="21.5"/>
-                <w:szCs w:val="21.5"/>
+                <w:sz w:val="13.4"/>
+                <w:szCs w:val="13.4"/>
+              </w:rPr>
+            </w:pPr>
+            <w:r>
+              <w:rPr>
+                <w:sz w:val="13.4"/>
+                <w:szCs w:val="13.4"/>
+                <w:rtl w:val="0"/>
+              </w:rPr>
+              <w:t xml:space="preserve">NAVIGATION CHIEF • NEWS REPORTER #3 • GOSSIPING STUDENT #3</w:t>
+            </w:r>
+          </w:p>
+          <w:p>
+            <w:pPr>
+              <w:widowControl w:val="0"/>
+              <w:spacing w:line="240" w:lineRule="auto"/>
+              <w:jc w:val="center"/>
+              <w:rPr>
+                <w:b w:val="1"/>
+                <w:bCs w:val="1"/>
+                <w:sz w:val="20.5"/>
+                <w:szCs w:val="20.5"/>
+              </w:rPr>
+            </w:pPr>
+            <w:r>
+              <w:rPr>
+                <w:b w:val="1"/>
+                <w:bCs w:val="1"/>
+                <w:sz w:val="20.5"/>
+                <w:szCs w:val="20.5"/>
                 <w:rtl w:val="0"/>
               </w:rPr>
               <w:t xml:space="preserve">Eiji Ren</w:t>
@@ -4389,7 +4431,7 @@
       <w:tr>
         <w:trPr>
           <w:cantSplit w:val="0"/>
-          <w:trHeight w:val="1023.25927734375" w:hRule="atLeast"/>
+          <w:trHeight w:val="630" w:hRule="atLeast"/>
           <w:tblHeader w:val="0"/>
         </w:trPr>
         <w:tc>
@@ -4401,9 +4443,9 @@
               <w:right w:color="000000" w:space="0" w:sz="0" w:val="nil"/>
             </w:tcBorders>
             <w:tcMar>
-              <w:top w:w="40.0" w:type="dxa"/>
+              <w:top w:w="20.0" w:type="dxa"/>
               <w:left w:w="80.0" w:type="dxa"/>
-              <w:bottom w:w="40.0" w:type="dxa"/>
+              <w:bottom w:w="20.0" w:type="dxa"/>
               <w:right w:w="80.0" w:type="dxa"/>
             </w:tcMar>
             <w:vAlign w:val="center"/>
@@ -4411,43 +4453,85 @@
           <w:p>
             <w:pPr>
               <w:widowControl w:val="0"/>
-              <w:spacing w:after="60" w:line="240" w:lineRule="auto"/>
-              <w:jc w:val="center"/>
-              <w:rPr>
-                <w:sz w:val="14.2"/>
-                <w:szCs w:val="14.2"/>
-              </w:rPr>
-            </w:pPr>
-            <w:r>
-              <w:rPr>
-                <w:sz w:val="14.2"/>
-                <w:szCs w:val="14.2"/>
-                <w:rtl w:val="0"/>
-              </w:rPr>
-              <w:t xml:space="preserve">QUEEN ELIZABETH NEWARK</w:t>
-            </w:r>
-          </w:p>
-          <w:p>
-            <w:pPr>
-              <w:widowControl w:val="0"/>
               <w:spacing w:line="240" w:lineRule="auto"/>
               <w:jc w:val="center"/>
               <w:rPr>
-                <w:b w:val="1"/>
-                <w:bCs w:val="1"/>
-                <w:sz w:val="21.5"/>
-                <w:szCs w:val="21.5"/>
-              </w:rPr>
-            </w:pPr>
-            <w:r>
-              <w:rPr>
-                <w:b w:val="1"/>
-                <w:bCs w:val="1"/>
-                <w:sz w:val="21.5"/>
-                <w:szCs w:val="21.5"/>
+                <w:sz w:val="13.4"/>
+                <w:szCs w:val="13.4"/>
+              </w:rPr>
+            </w:pPr>
+            <w:r>
+              <w:rPr>
+                <w:sz w:val="13.4"/>
+                <w:szCs w:val="13.4"/>
+                <w:rtl w:val="0"/>
+              </w:rPr>
+              <w:t xml:space="preserve">QUEEN ELIZABETH NEWARK</w:t>
+            </w:r>
+          </w:p>
+          <w:p>
+            <w:pPr>
+              <w:widowControl w:val="0"/>
+              <w:spacing w:line="240" w:lineRule="auto"/>
+              <w:jc w:val="center"/>
+              <w:rPr>
+                <w:b w:val="1"/>
+                <w:bCs w:val="1"/>
+                <w:sz w:val="20.5"/>
+                <w:szCs w:val="20.5"/>
+              </w:rPr>
+            </w:pPr>
+            <w:r>
+              <w:rPr>
+                <w:b w:val="1"/>
+                <w:bCs w:val="1"/>
+                <w:sz w:val="20.5"/>
+                <w:szCs w:val="20.5"/>
                 <w:rtl w:val="0"/>
               </w:rPr>
               <w:t xml:space="preserve">Ariana Osmanzai</w:t>
+            </w:r>
+          </w:p>
+          <w:p>
+            <w:pPr>
+              <w:widowControl w:val="0"/>
+              <w:spacing w:before="80" w:line="240" w:lineRule="auto"/>
+              <w:jc w:val="center"/>
+              <w:rPr>
+                <w:sz w:val="13.4"/>
+                <w:szCs w:val="13.4"/>
+              </w:rPr>
+            </w:pPr>
+            <w:r>
+              <w:rPr>
+                <w:sz w:val="13.4"/>
+                <w:szCs w:val="13.4"/>
+                <w:rtl w:val="0"/>
+              </w:rPr>
+              <w:t xml:space="preserve">BARTHOLEMEW BARTHANDELUS</w:t>
+            </w:r>
+          </w:p>
+          <w:p>
+            <w:pPr>
+              <w:widowControl w:val="0"/>
+              <w:spacing w:line="240" w:lineRule="auto"/>
+              <w:jc w:val="center"/>
+              <w:rPr>
+                <w:b w:val="1"/>
+                <w:bCs w:val="1"/>
+                <w:sz w:val="20.5"/>
+                <w:szCs w:val="20.5"/>
+              </w:rPr>
+            </w:pPr>
+            <w:r>
+              <w:rPr>
+                <w:b w:val="1"/>
+                <w:bCs w:val="1"/>
+                <w:sz w:val="20.5"/>
+                <w:szCs w:val="20.5"/>
+                <w:rtl w:val="0"/>
+              </w:rPr>
+              <w:t xml:space="preserve">Connor “Bear” Barre</w:t>
             </w:r>
           </w:p>
         </w:tc>
@@ -4460,9 +4544,9 @@
               <w:right w:color="000000" w:space="0" w:sz="0" w:val="nil"/>
             </w:tcBorders>
             <w:tcMar>
-              <w:top w:w="40.0" w:type="dxa"/>
+              <w:top w:w="20.0" w:type="dxa"/>
               <w:left w:w="80.0" w:type="dxa"/>
-              <w:bottom w:w="40.0" w:type="dxa"/>
+              <w:bottom w:w="20.0" w:type="dxa"/>
               <w:right w:w="80.0" w:type="dxa"/>
             </w:tcMar>
             <w:vAlign w:val="center"/>
@@ -4470,43 +4554,20 @@
           <w:p>
             <w:pPr>
               <w:widowControl w:val="0"/>
-              <w:spacing w:after="60" w:line="240" w:lineRule="auto"/>
-              <w:jc w:val="center"/>
-              <w:rPr>
-                <w:sz w:val="14.2"/>
-                <w:szCs w:val="14.2"/>
-              </w:rPr>
-            </w:pPr>
-            <w:r>
-              <w:rPr>
-                <w:sz w:val="14.2"/>
-                <w:szCs w:val="14.2"/>
-                <w:rtl w:val="0"/>
-              </w:rPr>
-              <w:t xml:space="preserve">JOSEPH “JOJO” CHEN</w:t>
-            </w:r>
-          </w:p>
-          <w:p>
-            <w:pPr>
-              <w:widowControl w:val="0"/>
               <w:spacing w:line="240" w:lineRule="auto"/>
               <w:jc w:val="center"/>
               <w:rPr>
-                <w:b w:val="1"/>
-                <w:bCs w:val="1"/>
-                <w:sz w:val="21.5"/>
-                <w:szCs w:val="21.5"/>
-              </w:rPr>
-            </w:pPr>
-            <w:r>
-              <w:rPr>
-                <w:b w:val="1"/>
-                <w:bCs w:val="1"/>
-                <w:sz w:val="21.5"/>
-                <w:szCs w:val="21.5"/>
-                <w:rtl w:val="0"/>
-              </w:rPr>
-              <w:t xml:space="preserve">Abraham “AJ” Lopez</w:t>
+                <w:sz w:val="13.4"/>
+                <w:szCs w:val="13.4"/>
+              </w:rPr>
+            </w:pPr>
+            <w:r>
+              <w:rPr>
+                <w:sz w:val="13.4"/>
+                <w:szCs w:val="13.4"/>
+                <w:rtl w:val="0"/>
+              </w:rPr>
+              <w:t xml:space="preserve">JOSEPH “JOJO” CHEN</w:t>
             </w:r>
           </w:p>
           <w:p>
@@ -4517,33 +4578,19 @@
               <w:rPr>
                 <w:b w:val="1"/>
                 <w:bCs w:val="1"/>
-                <w:sz w:val="21.5"/>
-                <w:szCs w:val="21.5"/>
-              </w:rPr>
-            </w:pPr>
-            <w:r>
-              <w:rPr>
-                <w:rtl w:val="0"/>
-              </w:rPr>
-            </w:r>
-          </w:p>
-          <w:p>
-            <w:pPr>
-              <w:widowControl w:val="0"/>
-              <w:spacing w:after="60" w:line="240" w:lineRule="auto"/>
-              <w:jc w:val="center"/>
-              <w:rPr>
-                <w:sz w:val="14.2"/>
-                <w:szCs w:val="14.2"/>
-              </w:rPr>
-            </w:pPr>
-            <w:r>
-              <w:rPr>
-                <w:sz w:val="14.2"/>
-                <w:szCs w:val="14.2"/>
-                <w:rtl w:val="0"/>
-              </w:rPr>
-              <w:t xml:space="preserve">BARTHOLEMEW BARTHANDELUS</w:t>
+                <w:sz w:val="20.5"/>
+                <w:szCs w:val="20.5"/>
+              </w:rPr>
+            </w:pPr>
+            <w:r>
+              <w:rPr>
+                <w:b w:val="1"/>
+                <w:bCs w:val="1"/>
+                <w:sz w:val="20.5"/>
+                <w:szCs w:val="20.5"/>
+                <w:rtl w:val="0"/>
+              </w:rPr>
+              <w:t xml:space="preserve">Abraham “AJ” Lopez</w:t>
             </w:r>
           </w:p>
           <w:p>
@@ -4554,19 +4601,14 @@
               <w:rPr>
                 <w:b w:val="1"/>
                 <w:bCs w:val="1"/>
-                <w:sz w:val="21.5"/>
-                <w:szCs w:val="21.5"/>
-              </w:rPr>
-            </w:pPr>
-            <w:r>
-              <w:rPr>
-                <w:b w:val="1"/>
-                <w:bCs w:val="1"/>
-                <w:sz w:val="21.5"/>
-                <w:szCs w:val="21.5"/>
-                <w:rtl w:val="0"/>
-              </w:rPr>
-              <w:t xml:space="preserve">Connor “Bear” Barre</w:t>
+                <w:sz w:val="20.5"/>
+                <w:szCs w:val="20.5"/>
+              </w:rPr>
+            </w:pPr>
+            <w:r>
+              <w:rPr>
+                <w:rtl w:val="0"/>
+              </w:rPr>
             </w:r>
           </w:p>
         </w:tc>
@@ -4579,9 +4621,9 @@
               <w:right w:color="000000" w:space="0" w:sz="0" w:val="nil"/>
             </w:tcBorders>
             <w:tcMar>
-              <w:top w:w="40.0" w:type="dxa"/>
+              <w:top w:w="20.0" w:type="dxa"/>
               <w:left w:w="80.0" w:type="dxa"/>
-              <w:bottom w:w="40.0" w:type="dxa"/>
+              <w:bottom w:w="20.0" w:type="dxa"/>
               <w:right w:w="80.0" w:type="dxa"/>
             </w:tcMar>
             <w:vAlign w:val="center"/>
@@ -4589,62 +4631,20 @@
           <w:p>
             <w:pPr>
               <w:widowControl w:val="0"/>
-              <w:spacing w:after="60" w:line="240" w:lineRule="auto"/>
-              <w:jc w:val="center"/>
-              <w:rPr>
-                <w:sz w:val="14.2"/>
-                <w:szCs w:val="14.2"/>
-              </w:rPr>
-            </w:pPr>
-            <w:r>
-              <w:rPr>
-                <w:sz w:val="14.2"/>
-                <w:szCs w:val="14.2"/>
-                <w:rtl w:val="0"/>
-              </w:rPr>
-              <w:t xml:space="preserve">PROFESSOR WELLINGTON</w:t>
-            </w:r>
-          </w:p>
-          <w:p>
-            <w:pPr>
-              <w:widowControl w:val="0"/>
               <w:spacing w:line="240" w:lineRule="auto"/>
               <w:jc w:val="center"/>
               <w:rPr>
-                <w:b w:val="1"/>
-                <w:bCs w:val="1"/>
-                <w:sz w:val="21.5"/>
-                <w:szCs w:val="21.5"/>
-              </w:rPr>
-            </w:pPr>
-            <w:r>
-              <w:rPr>
-                <w:b w:val="1"/>
-                <w:bCs w:val="1"/>
-                <w:sz w:val="21.5"/>
-                <w:szCs w:val="21.5"/>
-                <w:rtl w:val="0"/>
-              </w:rPr>
-              <w:t xml:space="preserve">Delaney R. Page</w:t>
-            </w:r>
-          </w:p>
-          <w:p>
-            <w:pPr>
-              <w:widowControl w:val="0"/>
-              <w:spacing w:after="60" w:line="240" w:lineRule="auto"/>
-              <w:jc w:val="center"/>
-              <w:rPr>
-                <w:sz w:val="14.2"/>
-                <w:szCs w:val="14.2"/>
-              </w:rPr>
-            </w:pPr>
-            <w:r>
-              <w:rPr>
-                <w:sz w:val="14.2"/>
-                <w:szCs w:val="14.2"/>
-                <w:rtl w:val="0"/>
-              </w:rPr>
-              <w:t xml:space="preserve">NEWS REPORTER #2 • GOSSIPING STUDENT #2</w:t>
+                <w:sz w:val="13.4"/>
+                <w:szCs w:val="13.4"/>
+              </w:rPr>
+            </w:pPr>
+            <w:r>
+              <w:rPr>
+                <w:sz w:val="13.4"/>
+                <w:szCs w:val="13.4"/>
+                <w:rtl w:val="0"/>
+              </w:rPr>
+              <w:t xml:space="preserve">PROFESSOR WELLINGTON</w:t>
             </w:r>
           </w:p>
           <w:p>
@@ -4655,19 +4655,37 @@
               <w:rPr>
                 <w:b w:val="1"/>
                 <w:bCs w:val="1"/>
-                <w:sz w:val="21.5"/>
-                <w:szCs w:val="21.5"/>
-              </w:rPr>
-            </w:pPr>
-            <w:r>
-              <w:rPr>
-                <w:b w:val="1"/>
-                <w:bCs w:val="1"/>
-                <w:sz w:val="21.5"/>
-                <w:szCs w:val="21.5"/>
-                <w:rtl w:val="0"/>
-              </w:rPr>
-              <w:t xml:space="preserve">Ashley Mendez</w:t>
+                <w:sz w:val="20.5"/>
+                <w:szCs w:val="20.5"/>
+              </w:rPr>
+            </w:pPr>
+            <w:r>
+              <w:rPr>
+                <w:b w:val="1"/>
+                <w:bCs w:val="1"/>
+                <w:sz w:val="20.5"/>
+                <w:szCs w:val="20.5"/>
+                <w:rtl w:val="0"/>
+              </w:rPr>
+              <w:t xml:space="preserve">Delaney R. Page</w:t>
+            </w:r>
+          </w:p>
+          <w:p>
+            <w:pPr>
+              <w:widowControl w:val="0"/>
+              <w:spacing w:line="240" w:lineRule="auto"/>
+              <w:jc w:val="center"/>
+              <w:rPr>
+                <w:b w:val="1"/>
+                <w:bCs w:val="1"/>
+                <w:sz w:val="20.5"/>
+                <w:szCs w:val="20.5"/>
+              </w:rPr>
+            </w:pPr>
+            <w:r>
+              <w:rPr>
+                <w:rtl w:val="0"/>
+              </w:rPr>
             </w:r>
           </w:p>
         </w:tc>
@@ -4675,7 +4693,7 @@
       <w:tr>
         <w:trPr>
           <w:cantSplit w:val="0"/>
-          <w:trHeight w:val="625.4248088360239" w:hRule="atLeast"/>
+          <w:trHeight w:val="630" w:hRule="atLeast"/>
           <w:tblHeader w:val="0"/>
         </w:trPr>
         <w:tc>
@@ -4687,9 +4705,9 @@
               <w:right w:color="000000" w:space="0" w:sz="0" w:val="nil"/>
             </w:tcBorders>
             <w:tcMar>
-              <w:top w:w="40.0" w:type="dxa"/>
+              <w:top w:w="20.0" w:type="dxa"/>
               <w:left w:w="80.0" w:type="dxa"/>
-              <w:bottom w:w="40.0" w:type="dxa"/>
+              <w:bottom w:w="20.0" w:type="dxa"/>
               <w:right w:w="80.0" w:type="dxa"/>
             </w:tcMar>
             <w:vAlign w:val="center"/>
@@ -4746,9 +4764,9 @@
               <w:right w:color="000000" w:space="0" w:sz="0" w:val="nil"/>
             </w:tcBorders>
             <w:tcMar>
-              <w:top w:w="40.0" w:type="dxa"/>
+              <w:top w:w="20.0" w:type="dxa"/>
               <w:left w:w="80.0" w:type="dxa"/>
-              <w:bottom w:w="40.0" w:type="dxa"/>
+              <w:bottom w:w="20.0" w:type="dxa"/>
               <w:right w:w="80.0" w:type="dxa"/>
             </w:tcMar>
             <w:vAlign w:val="center"/>
@@ -4805,9 +4823,9 @@
               <w:right w:color="000000" w:space="0" w:sz="0" w:val="nil"/>
             </w:tcBorders>
             <w:tcMar>
-              <w:top w:w="40.0" w:type="dxa"/>
+              <w:top w:w="20.0" w:type="dxa"/>
               <w:left w:w="80.0" w:type="dxa"/>
-              <w:bottom w:w="40.0" w:type="dxa"/>
+              <w:bottom w:w="20.0" w:type="dxa"/>
               <w:right w:w="80.0" w:type="dxa"/>
             </w:tcMar>
             <w:vAlign w:val="center"/>
@@ -4859,7 +4877,7 @@
       <w:tr>
         <w:trPr>
           <w:cantSplit w:val="0"/>
-          <w:trHeight w:val="510" w:hRule="atLeast"/>
+          <w:trHeight w:val="630" w:hRule="atLeast"/>
           <w:tblHeader w:val="0"/>
         </w:trPr>
         <w:tc>
@@ -4871,9 +4889,9 @@
               <w:right w:color="000000" w:space="0" w:sz="0" w:val="nil"/>
             </w:tcBorders>
             <w:tcMar>
-              <w:top w:w="40.0" w:type="dxa"/>
+              <w:top w:w="20.0" w:type="dxa"/>
               <w:left w:w="80.0" w:type="dxa"/>
-              <w:bottom w:w="40.0" w:type="dxa"/>
+              <w:bottom w:w="20.0" w:type="dxa"/>
               <w:right w:w="80.0" w:type="dxa"/>
             </w:tcMar>
             <w:vAlign w:val="center"/>
@@ -4930,9 +4948,9 @@
               <w:right w:color="000000" w:space="0" w:sz="0" w:val="nil"/>
             </w:tcBorders>
             <w:tcMar>
-              <w:top w:w="40.0" w:type="dxa"/>
+              <w:top w:w="20.0" w:type="dxa"/>
               <w:left w:w="80.0" w:type="dxa"/>
-              <w:bottom w:w="40.0" w:type="dxa"/>
+              <w:bottom w:w="20.0" w:type="dxa"/>
               <w:right w:w="80.0" w:type="dxa"/>
             </w:tcMar>
             <w:vAlign w:val="center"/>
@@ -4989,9 +5007,9 @@
               <w:right w:color="000000" w:space="0" w:sz="0" w:val="nil"/>
             </w:tcBorders>
             <w:tcMar>
-              <w:top w:w="40.0" w:type="dxa"/>
+              <w:top w:w="20.0" w:type="dxa"/>
               <w:left w:w="80.0" w:type="dxa"/>
-              <w:bottom w:w="40.0" w:type="dxa"/>
+              <w:bottom w:w="20.0" w:type="dxa"/>
               <w:right w:w="80.0" w:type="dxa"/>
             </w:tcMar>
             <w:vAlign w:val="center"/>
@@ -5043,7 +5061,7 @@
       <w:tr>
         <w:trPr>
           <w:cantSplit w:val="0"/>
-          <w:trHeight w:val="625.4248088360239" w:hRule="atLeast"/>
+          <w:trHeight w:val="630" w:hRule="atLeast"/>
           <w:tblHeader w:val="0"/>
         </w:trPr>
         <w:tc>
@@ -5055,9 +5073,9 @@
               <w:right w:color="000000" w:space="0" w:sz="0" w:val="nil"/>
             </w:tcBorders>
             <w:tcMar>
-              <w:top w:w="40.0" w:type="dxa"/>
+              <w:top w:w="20.0" w:type="dxa"/>
               <w:left w:w="80.0" w:type="dxa"/>
-              <w:bottom w:w="40.0" w:type="dxa"/>
+              <w:bottom w:w="20.0" w:type="dxa"/>
               <w:right w:w="80.0" w:type="dxa"/>
             </w:tcMar>
             <w:vAlign w:val="center"/>
@@ -5114,9 +5132,9 @@
               <w:right w:color="000000" w:space="0" w:sz="0" w:val="nil"/>
             </w:tcBorders>
             <w:tcMar>
-              <w:top w:w="40.0" w:type="dxa"/>
+              <w:top w:w="20.0" w:type="dxa"/>
               <w:left w:w="80.0" w:type="dxa"/>
-              <w:bottom w:w="40.0" w:type="dxa"/>
+              <w:bottom w:w="20.0" w:type="dxa"/>
               <w:right w:w="80.0" w:type="dxa"/>
             </w:tcMar>
             <w:vAlign w:val="center"/>
@@ -5173,9 +5191,9 @@
               <w:right w:color="000000" w:space="0" w:sz="0" w:val="nil"/>
             </w:tcBorders>
             <w:tcMar>
-              <w:top w:w="40.0" w:type="dxa"/>
+              <w:top w:w="20.0" w:type="dxa"/>
               <w:left w:w="80.0" w:type="dxa"/>
-              <w:bottom w:w="40.0" w:type="dxa"/>
+              <w:bottom w:w="20.0" w:type="dxa"/>
               <w:right w:w="80.0" w:type="dxa"/>
             </w:tcMar>
             <w:vAlign w:val="center"/>
@@ -5227,7 +5245,7 @@
       <w:tr>
         <w:trPr>
           <w:cantSplit w:val="0"/>
-          <w:trHeight w:val="760.9297297184655" w:hRule="atLeast"/>
+          <w:trHeight w:val="630" w:hRule="atLeast"/>
           <w:tblHeader w:val="0"/>
         </w:trPr>
         <w:tc>
@@ -5239,9 +5257,9 @@
               <w:right w:color="000000" w:space="0" w:sz="0" w:val="nil"/>
             </w:tcBorders>
             <w:tcMar>
-              <w:top w:w="40.0" w:type="dxa"/>
+              <w:top w:w="20.0" w:type="dxa"/>
               <w:left w:w="80.0" w:type="dxa"/>
-              <w:bottom w:w="40.0" w:type="dxa"/>
+              <w:bottom w:w="20.0" w:type="dxa"/>
               <w:right w:w="80.0" w:type="dxa"/>
             </w:tcMar>
             <w:vAlign w:val="center"/>
@@ -5298,9 +5316,9 @@
               <w:right w:color="000000" w:space="0" w:sz="0" w:val="nil"/>
             </w:tcBorders>
             <w:tcMar>
-              <w:top w:w="40.0" w:type="dxa"/>
+              <w:top w:w="20.0" w:type="dxa"/>
               <w:left w:w="80.0" w:type="dxa"/>
-              <w:bottom w:w="40.0" w:type="dxa"/>
+              <w:bottom w:w="20.0" w:type="dxa"/>
               <w:right w:w="80.0" w:type="dxa"/>
             </w:tcMar>
             <w:vAlign w:val="center"/>
@@ -5357,9 +5375,9 @@
               <w:right w:color="000000" w:space="0" w:sz="0" w:val="nil"/>
             </w:tcBorders>
             <w:tcMar>
-              <w:top w:w="40.0" w:type="dxa"/>
+              <w:top w:w="20.0" w:type="dxa"/>
               <w:left w:w="80.0" w:type="dxa"/>
-              <w:bottom w:w="40.0" w:type="dxa"/>
+              <w:bottom w:w="20.0" w:type="dxa"/>
               <w:right w:w="80.0" w:type="dxa"/>
             </w:tcMar>
             <w:vAlign w:val="center"/>
@@ -5411,7 +5429,7 @@
       <w:tr>
         <w:trPr>
           <w:cantSplit w:val="0"/>
-          <w:trHeight w:val="760.9297297184655" w:hRule="atLeast"/>
+          <w:trHeight w:val="630" w:hRule="atLeast"/>
           <w:tblHeader w:val="0"/>
         </w:trPr>
         <w:tc>
@@ -5423,9 +5441,9 @@
               <w:right w:color="000000" w:space="0" w:sz="0" w:val="nil"/>
             </w:tcBorders>
             <w:tcMar>
-              <w:top w:w="40.0" w:type="dxa"/>
+              <w:top w:w="20.0" w:type="dxa"/>
               <w:left w:w="80.0" w:type="dxa"/>
-              <w:bottom w:w="40.0" w:type="dxa"/>
+              <w:bottom w:w="20.0" w:type="dxa"/>
               <w:right w:w="80.0" w:type="dxa"/>
             </w:tcMar>
             <w:vAlign w:val="center"/>
@@ -5482,9 +5500,9 @@
               <w:right w:color="000000" w:space="0" w:sz="0" w:val="nil"/>
             </w:tcBorders>
             <w:tcMar>
-              <w:top w:w="40.0" w:type="dxa"/>
+              <w:top w:w="20.0" w:type="dxa"/>
               <w:left w:w="80.0" w:type="dxa"/>
-              <w:bottom w:w="40.0" w:type="dxa"/>
+              <w:bottom w:w="20.0" w:type="dxa"/>
               <w:right w:w="80.0" w:type="dxa"/>
             </w:tcMar>
             <w:vAlign w:val="center"/>
@@ -5559,9 +5577,9 @@
               <w:right w:color="000000" w:space="0" w:sz="0" w:val="nil"/>
             </w:tcBorders>
             <w:tcMar>
-              <w:top w:w="40.0" w:type="dxa"/>
+              <w:top w:w="20.0" w:type="dxa"/>
               <w:left w:w="80.0" w:type="dxa"/>
-              <w:bottom w:w="40.0" w:type="dxa"/>
+              <w:bottom w:w="20.0" w:type="dxa"/>
               <w:right w:w="80.0" w:type="dxa"/>
             </w:tcMar>
             <w:vAlign w:val="center"/>
@@ -5626,6 +5644,48 @@
         <w:rPr>
           <w:rtl w:val="0"/>
         </w:rPr>
+      </w:r>
+      <w:r>
+        <w:drawing>
+          <wp:anchor allowOverlap="1" behindDoc="1" distB="114300" distT="114300" distL="114300" distR="114300" hidden="0" layoutInCell="1" locked="0" relativeHeight="0" simplePos="0">
+            <wp:simplePos x="0" y="0"/>
+            <wp:positionH relativeFrom="column">
+              <wp:posOffset>4781550</wp:posOffset>
+            </wp:positionH>
+            <wp:positionV relativeFrom="paragraph">
+              <wp:posOffset>852488</wp:posOffset>
+            </wp:positionV>
+            <wp:extent cx="1157288" cy="850537"/>
+            <wp:effectExtent b="0" l="0" r="0" t="0"/>
+            <wp:wrapNone/>
+            <wp:docPr id="8" name="image6.jpg"/>
+            <a:graphic>
+              <a:graphicData uri="http://schemas.openxmlformats.org/drawingml/2006/picture">
+                <pic:pic>
+                  <pic:nvPicPr>
+                    <pic:cNvPr id="0" name="image6.jpg"/>
+                    <pic:cNvPicPr preferRelativeResize="0"/>
+                  </pic:nvPicPr>
+                  <pic:blipFill>
+                    <a:blip r:embed="rId21"/>
+                    <a:srcRect b="0" l="0" r="0" t="0"/>
+                    <a:stretch>
+                      <a:fillRect/>
+                    </a:stretch>
+                  </pic:blipFill>
+                  <pic:spPr>
+                    <a:xfrm>
+                      <a:off x="0" y="0"/>
+                      <a:ext cx="1157288" cy="850537"/>
+                    </a:xfrm>
+                    <a:prstGeom prst="rect"/>
+                    <a:ln/>
+                  </pic:spPr>
+                </pic:pic>
+              </a:graphicData>
+            </a:graphic>
+          </wp:anchor>
+        </w:drawing>
       </w:r>
       <w:r>
         <w:drawing>
@@ -5640,16 +5700,16 @@
             <wp:extent cx="1576388" cy="1124187"/>
             <wp:effectExtent b="0" l="0" r="0" t="0"/>
             <wp:wrapNone/>
-            <wp:docPr id="10" name="image3.png"/>
+            <wp:docPr id="10" name="image4.png"/>
             <a:graphic>
               <a:graphicData uri="http://schemas.openxmlformats.org/drawingml/2006/picture">
                 <pic:pic>
                   <pic:nvPicPr>
-                    <pic:cNvPr id="0" name="image3.png"/>
+                    <pic:cNvPr id="0" name="image4.png"/>
                     <pic:cNvPicPr preferRelativeResize="0"/>
                   </pic:nvPicPr>
                   <pic:blipFill>
-                    <a:blip r:embed="rId21"/>
+                    <a:blip r:embed="rId22"/>
                     <a:srcRect b="0" l="0" r="0" t="0"/>
                     <a:stretch>
                       <a:fillRect/>
@@ -5682,54 +5742,12 @@
             <wp:extent cx="1118409" cy="1939582"/>
             <wp:effectExtent b="0" l="0" r="0" t="0"/>
             <wp:wrapNone/>
-            <wp:docPr id="2" name="image16.png"/>
+            <wp:docPr id="4" name="image9.png"/>
             <a:graphic>
               <a:graphicData uri="http://schemas.openxmlformats.org/drawingml/2006/picture">
                 <pic:pic>
                   <pic:nvPicPr>
-                    <pic:cNvPr id="0" name="image16.png"/>
-                    <pic:cNvPicPr preferRelativeResize="0"/>
-                  </pic:nvPicPr>
-                  <pic:blipFill>
-                    <a:blip r:embed="rId22"/>
-                    <a:srcRect b="0" l="0" r="0" t="0"/>
-                    <a:stretch>
-                      <a:fillRect/>
-                    </a:stretch>
-                  </pic:blipFill>
-                  <pic:spPr>
-                    <a:xfrm>
-                      <a:off x="0" y="0"/>
-                      <a:ext cx="1118409" cy="1939582"/>
-                    </a:xfrm>
-                    <a:prstGeom prst="rect"/>
-                    <a:ln/>
-                  </pic:spPr>
-                </pic:pic>
-              </a:graphicData>
-            </a:graphic>
-          </wp:anchor>
-        </w:drawing>
-      </w:r>
-      <w:r>
-        <w:drawing>
-          <wp:anchor allowOverlap="1" behindDoc="1" distB="114300" distT="114300" distL="114300" distR="114300" hidden="0" layoutInCell="1" locked="0" relativeHeight="0" simplePos="0">
-            <wp:simplePos x="0" y="0"/>
-            <wp:positionH relativeFrom="column">
-              <wp:posOffset>4781550</wp:posOffset>
-            </wp:positionH>
-            <wp:positionV relativeFrom="paragraph">
-              <wp:posOffset>852488</wp:posOffset>
-            </wp:positionV>
-            <wp:extent cx="1157288" cy="850537"/>
-            <wp:effectExtent b="0" l="0" r="0" t="0"/>
-            <wp:wrapNone/>
-            <wp:docPr id="7" name="image8.jpg"/>
-            <a:graphic>
-              <a:graphicData uri="http://schemas.openxmlformats.org/drawingml/2006/picture">
-                <pic:pic>
-                  <pic:nvPicPr>
-                    <pic:cNvPr id="0" name="image8.jpg"/>
+                    <pic:cNvPr id="0" name="image9.png"/>
                     <pic:cNvPicPr preferRelativeResize="0"/>
                   </pic:nvPicPr>
                   <pic:blipFill>
@@ -5742,7 +5760,7 @@
                   <pic:spPr>
                     <a:xfrm>
                       <a:off x="0" y="0"/>
-                      <a:ext cx="1157288" cy="850537"/>
+                      <a:ext cx="1118409" cy="1939582"/>
                     </a:xfrm>
                     <a:prstGeom prst="rect"/>
                     <a:ln/>
@@ -5826,7 +5844,7 @@
           <w:pgNumType w:start="1"/>
         </w:sectPr>
       </w:pPr>
-      <w:bookmarkStart w:colFirst="0" w:colLast="0" w:name="_pzl2stahi8pr" w:id="1"/>
+      <w:bookmarkStart w:colFirst="0" w:colLast="0" w:name="_t37cu81otk24" w:id="1"/>
       <w:bookmarkEnd w:id="1"/>
       <w:r>
         <w:rPr>
@@ -5981,12 +5999,12 @@
             <wp:extent cx="2644915" cy="1666875"/>
             <wp:effectExtent b="0" l="0" r="0" t="0"/>
             <wp:wrapNone/>
-            <wp:docPr id="5" name="image6.png"/>
+            <wp:docPr id="2" name="image8.png"/>
             <a:graphic>
               <a:graphicData uri="http://schemas.openxmlformats.org/drawingml/2006/picture">
                 <pic:pic>
                   <pic:nvPicPr>
-                    <pic:cNvPr id="0" name="image6.png"/>
+                    <pic:cNvPr id="0" name="image8.png"/>
                     <pic:cNvPicPr preferRelativeResize="0"/>
                   </pic:nvPicPr>
                   <pic:blipFill>
@@ -8570,12 +8588,12 @@
         <wp:inline distB="0" distT="0" distL="114300" distR="114300">
           <wp:extent cx="190500" cy="190500"/>
           <wp:effectExtent b="0" l="0" r="0" t="0"/>
-          <wp:docPr id="4" name="image1.png"/>
+          <wp:docPr id="6" name="image7.png"/>
           <a:graphic>
             <a:graphicData uri="http://schemas.openxmlformats.org/drawingml/2006/picture">
               <pic:pic>
                 <pic:nvPicPr>
-                  <pic:cNvPr id="0" name="image1.png"/>
+                  <pic:cNvPr id="0" name="image7.png"/>
                   <pic:cNvPicPr preferRelativeResize="0"/>
                 </pic:nvPicPr>
                 <pic:blipFill>
@@ -8611,12 +8629,12 @@
         <wp:inline distB="0" distT="0" distL="114300" distR="114300">
           <wp:extent cx="190500" cy="190500"/>
           <wp:effectExtent b="0" l="0" r="0" t="0"/>
-          <wp:docPr id="8" name="image7.png"/>
+          <wp:docPr id="7" name="image2.png"/>
           <a:graphic>
             <a:graphicData uri="http://schemas.openxmlformats.org/drawingml/2006/picture">
               <pic:pic>
                 <pic:nvPicPr>
-                  <pic:cNvPr id="0" name="image7.png"/>
+                  <pic:cNvPr id="0" name="image2.png"/>
                   <pic:cNvPicPr preferRelativeResize="0"/>
                 </pic:nvPicPr>
                 <pic:blipFill>
@@ -8652,12 +8670,12 @@
         <wp:inline distB="0" distT="0" distL="114300" distR="114300">
           <wp:extent cx="190500" cy="190500"/>
           <wp:effectExtent b="0" l="0" r="0" t="0"/>
-          <wp:docPr id="3" name="image4.png"/>
+          <wp:docPr id="9" name="image1.png"/>
           <a:graphic>
             <a:graphicData uri="http://schemas.openxmlformats.org/drawingml/2006/picture">
               <pic:pic>
                 <pic:nvPicPr>
-                  <pic:cNvPr id="0" name="image4.png"/>
+                  <pic:cNvPr id="0" name="image1.png"/>
                   <pic:cNvPicPr preferRelativeResize="0"/>
                 </pic:nvPicPr>
                 <pic:blipFill>
@@ -8693,12 +8711,12 @@
         <wp:inline distB="0" distT="0" distL="114300" distR="114300">
           <wp:extent cx="190500" cy="190500"/>
           <wp:effectExtent b="0" l="0" r="0" t="0"/>
-          <wp:docPr id="6" name="image2.png"/>
+          <wp:docPr id="5" name="image5.png"/>
           <a:graphic>
             <a:graphicData uri="http://schemas.openxmlformats.org/drawingml/2006/picture">
               <pic:pic>
                 <pic:nvPicPr>
-                  <pic:cNvPr id="0" name="image2.png"/>
+                  <pic:cNvPr id="0" name="image5.png"/>
                   <pic:cNvPicPr preferRelativeResize="0"/>
                 </pic:nvPicPr>
                 <pic:blipFill>

</xml_diff>